<commit_message>
tuned parameters as best as I could
</commit_message>
<xml_diff>
--- a/Report_Presentation/Report.docx
+++ b/Report_Presentation/Report.docx
@@ -23,7 +23,7 @@
           <w:noProof/>
         </w:rPr>
         <w:drawing>
-          <wp:inline distT="0" distB="0" distL="0" distR="0" wp14:anchorId="6533012D" wp14:editId="3AFEAD93">
+          <wp:inline distT="0" distB="0" distL="0" distR="0" wp14:anchorId="6533012D" wp14:editId="03EF5E75">
             <wp:extent cx="3098479" cy="3098479"/>
             <wp:effectExtent l="0" t="0" r="0" b="6985"/>
             <wp:docPr id="1991105939" name="Picture 1" descr="A white circle with a black background&#10;&#10;AI-generated content may be incorrect."/>
@@ -1689,7 +1689,31 @@
         </w:sdtContent>
       </w:sdt>
       <w:r>
-        <w:t>, however, has been adapted to our specific use case. On a high level, the path-planning algorithm takes the following approach:</w:t>
+        <w:t xml:space="preserve">, however, has been adapted to our specific use case. </w:t>
+      </w:r>
+      <w:r>
+        <w:t xml:space="preserve">Key differences are pointed out throughout the text in Section </w:t>
+      </w:r>
+      <w:r>
+        <w:fldChar w:fldCharType="begin"/>
+      </w:r>
+      <w:r>
+        <w:instrText xml:space="preserve"> REF _Ref215081980 \r \h </w:instrText>
+      </w:r>
+      <w:r>
+        <w:fldChar w:fldCharType="separate"/>
+      </w:r>
+      <w:r>
+        <w:t>4.1</w:t>
+      </w:r>
+      <w:r>
+        <w:fldChar w:fldCharType="end"/>
+      </w:r>
+      <w:r>
+        <w:t xml:space="preserve">. </w:t>
+      </w:r>
+      <w:r>
+        <w:t>On a high level, the path-planning algorithm takes the following approach:</w:t>
       </w:r>
     </w:p>
     <w:p>
@@ -1701,7 +1725,19 @@
         </w:numPr>
       </w:pPr>
       <w:r>
-        <w:t>The station model is disaggregated into a triangular mesh of appropriate size for the path planning task</w:t>
+        <w:t xml:space="preserve">The station model is </w:t>
+      </w:r>
+      <w:r>
+        <w:t>pre-processed</w:t>
+      </w:r>
+      <w:r>
+        <w:t xml:space="preserve"> into a</w:t>
+      </w:r>
+      <w:r>
+        <w:t xml:space="preserve"> watertight</w:t>
+      </w:r>
+      <w:r>
+        <w:t xml:space="preserve"> triangular mesh of appropriate size for the path planning task</w:t>
       </w:r>
     </w:p>
     <w:p>
@@ -1726,7 +1762,13 @@
         </w:numPr>
       </w:pPr>
       <w:r>
-        <w:t xml:space="preserve">Viewpoints are then filtered. Redundant viewpoints are identified as viewpoints that in the line of sight of a face that is already covered by another viewpoint. These are removed from the set of viewpoints. </w:t>
+        <w:t xml:space="preserve">Viewpoints are then </w:t>
+      </w:r>
+      <w:r>
+        <w:t>reduced in number using a K-means clustering approach</w:t>
+      </w:r>
+      <w:r>
+        <w:t xml:space="preserve"> </w:t>
       </w:r>
     </w:p>
     <w:p>
@@ -1738,31 +1780,22 @@
         </w:numPr>
       </w:pPr>
       <w:r>
-        <w:t>The set of viewpoints is then processed to form a cost matrix which is informed by three key variables:</w:t>
-      </w:r>
-    </w:p>
-    <w:p>
-      <w:pPr>
-        <w:pStyle w:val="ListParagraph"/>
-        <w:numPr>
-          <w:ilvl w:val="1"/>
-          <w:numId w:val="5"/>
-        </w:numPr>
-      </w:pPr>
-      <w:r>
-        <w:t>Adjacency: the cost to travel from a viewpoint to a non-adjacent viewpoint is infinite</w:t>
-      </w:r>
-    </w:p>
-    <w:p>
-      <w:pPr>
-        <w:pStyle w:val="ListParagraph"/>
-        <w:numPr>
-          <w:ilvl w:val="1"/>
-          <w:numId w:val="5"/>
-        </w:numPr>
-      </w:pPr>
-      <w:r>
-        <w:t>Distance: the cost is proportional to the Euclidian distance between points</w:t>
+        <w:t xml:space="preserve">The </w:t>
+      </w:r>
+      <w:r>
+        <w:t>viewpoints are</w:t>
+      </w:r>
+      <w:r>
+        <w:t xml:space="preserve"> passed </w:t>
+      </w:r>
+      <w:r>
+        <w:t xml:space="preserve">to a </w:t>
+      </w:r>
+      <w:r>
+        <w:t xml:space="preserve">nearest neighbor </w:t>
+      </w:r>
+      <w:r>
+        <w:t>travelling salesman planner, which produces an ordered set of viewpoints</w:t>
       </w:r>
     </w:p>
     <w:p>
@@ -1774,7 +1807,60 @@
         </w:numPr>
       </w:pPr>
       <w:r>
-        <w:t>The cost matrix is passed to a travelling salesman planner, which produces an ordered set of viewpoints (the coordinates of the viewpoint, and the pointing angle to capture the view)</w:t>
+        <w:t>For each viewpoint a pointing angle is produced by producing a pointing vector to the closest face</w:t>
+      </w:r>
+    </w:p>
+    <w:p>
+      <w:pPr>
+        <w:pStyle w:val="ListParagraph"/>
+        <w:numPr>
+          <w:ilvl w:val="0"/>
+          <w:numId w:val="5"/>
+        </w:numPr>
+      </w:pPr>
+      <w:r>
+        <w:t>The viewpoints are passed to an optimizer which</w:t>
+      </w:r>
+      <w:r>
+        <w:t xml:space="preserve"> produces trajectories between each viewpoint, and</w:t>
+      </w:r>
+      <w:r>
+        <w:t xml:space="preserve"> </w:t>
+      </w:r>
+      <w:r>
+        <w:t>may slightly shift the viewpoint within a given tolerance. The optimizer s</w:t>
+      </w:r>
+      <w:r>
+        <w:t>eeks to produce delta-v impulses at each viewpoint that optimize the time to traverse the entire path, and the fuel consumed for the entirety of the trajectory</w:t>
+      </w:r>
+    </w:p>
+    <w:p>
+      <w:r>
+        <w:t xml:space="preserve">The path planner is discussed in more detail in </w:t>
+      </w:r>
+      <w:r>
+        <w:t>S</w:t>
+      </w:r>
+      <w:r>
+        <w:t xml:space="preserve">ection </w:t>
+      </w:r>
+      <w:r>
+        <w:fldChar w:fldCharType="begin"/>
+      </w:r>
+      <w:r>
+        <w:instrText xml:space="preserve"> REF _Ref215081980 \r \h </w:instrText>
+      </w:r>
+      <w:r>
+        <w:fldChar w:fldCharType="separate"/>
+      </w:r>
+      <w:r>
+        <w:t>4.1</w:t>
+      </w:r>
+      <w:r>
+        <w:fldChar w:fldCharType="end"/>
+      </w:r>
+      <w:r>
+        <w:t>.</w:t>
       </w:r>
     </w:p>
     <w:p>
@@ -1787,136 +1873,2383 @@
     </w:p>
     <w:p>
       <w:r>
+        <w:t>The path planner produces a path whereby the spacecrafts performs single impulses at each viewpoint that allow it to travel to the next viewpoint. However, for simulating our path in Mujoco, a PID controller was implemented, for several reasons:</w:t>
+      </w:r>
+    </w:p>
+    <w:p>
+      <w:pPr>
+        <w:pStyle w:val="ListParagraph"/>
+        <w:numPr>
+          <w:ilvl w:val="0"/>
+          <w:numId w:val="8"/>
+        </w:numPr>
+      </w:pPr>
+      <w:r>
+        <w:t>A PID controller with continuous control inputs to the thrusters allows for dwell time at viewpoints</w:t>
+      </w:r>
+    </w:p>
+    <w:p>
+      <w:pPr>
+        <w:pStyle w:val="ListParagraph"/>
+        <w:numPr>
+          <w:ilvl w:val="0"/>
+          <w:numId w:val="8"/>
+        </w:numPr>
+      </w:pPr>
+      <w:r>
+        <w:t>The PID controller allows for course correction in the case of external perturbations</w:t>
+      </w:r>
+    </w:p>
+    <w:p>
+      <w:pPr>
+        <w:pStyle w:val="ListParagraph"/>
+        <w:numPr>
+          <w:ilvl w:val="0"/>
+          <w:numId w:val="8"/>
+        </w:numPr>
+      </w:pPr>
+      <w:r>
+        <w:t>The traversal time using a PID controller is faster (at the expense of fuel use)</w:t>
+      </w:r>
+    </w:p>
+    <w:p>
+      <w:pPr>
+        <w:pStyle w:val="ListParagraph"/>
+        <w:numPr>
+          <w:ilvl w:val="0"/>
+          <w:numId w:val="8"/>
+        </w:numPr>
+      </w:pPr>
+      <w:r>
+        <w:t xml:space="preserve">The primary purpose of </w:t>
+      </w:r>
+      <w:r>
+        <w:t>the simulation was to confirm that a spacecraft could safely navigate the path without compromising the safety of the station</w:t>
+      </w:r>
+    </w:p>
+    <w:p>
+      <w:r>
+        <w:t xml:space="preserve">The implemented controller is described in detail in Section </w:t>
+      </w:r>
+      <w:r>
+        <w:fldChar w:fldCharType="begin"/>
+      </w:r>
+      <w:r>
+        <w:instrText xml:space="preserve"> REF _Ref215082070 \r \h </w:instrText>
+      </w:r>
+      <w:r>
+        <w:fldChar w:fldCharType="separate"/>
+      </w:r>
+      <w:r>
+        <w:t>4.2</w:t>
+      </w:r>
+      <w:r>
+        <w:fldChar w:fldCharType="end"/>
+      </w:r>
+      <w:r>
+        <w:t>.</w:t>
+      </w:r>
+    </w:p>
+    <w:p>
+      <w:pPr>
+        <w:pStyle w:val="Heading3"/>
+      </w:pPr>
+      <w:r>
+        <w:t>Anomaly Detection</w:t>
+      </w:r>
+    </w:p>
+    <w:p>
+      <w:r>
         <w:rPr>
           <w:highlight w:val="yellow"/>
         </w:rPr>
-        <w:t>Yunhao</w:t>
-      </w:r>
+        <w:t>Gourav</w:t>
+      </w:r>
+      <w:r>
+        <w:rPr>
+          <w:highlight w:val="yellow"/>
+        </w:rPr>
+        <w:t xml:space="preserve"> &amp; Skanda</w:t>
+      </w:r>
+    </w:p>
+    <w:p>
+      <w:pPr>
+        <w:pStyle w:val="Heading1"/>
+      </w:pPr>
+      <w:bookmarkStart w:id="6" w:name="_Ref213919560"/>
+      <w:r>
+        <w:t>Technical Contributions</w:t>
+      </w:r>
+      <w:bookmarkEnd w:id="6"/>
+    </w:p>
+    <w:p>
+      <w:pPr>
+        <w:pStyle w:val="Heading2"/>
+      </w:pPr>
+      <w:bookmarkStart w:id="7" w:name="_Ref215081980"/>
+      <w:r>
+        <w:t>Path Planning Algorithm</w:t>
+      </w:r>
+      <w:bookmarkEnd w:id="7"/>
     </w:p>
     <w:p>
       <w:pPr>
         <w:pStyle w:val="Heading3"/>
       </w:pPr>
       <w:r>
+        <w:t>3D Model Pre-Processing</w:t>
+      </w:r>
+    </w:p>
+    <w:p>
+      <w:pPr>
+        <w:pStyle w:val="Heading3"/>
+      </w:pPr>
+      <w:r>
+        <w:t>Viewpoint Generation &amp; Clustering</w:t>
+      </w:r>
+    </w:p>
+    <w:p>
+      <w:pPr>
+        <w:pStyle w:val="Heading3"/>
+      </w:pPr>
+      <w:r>
+        <w:t>Pointing Angle Generation</w:t>
+      </w:r>
+    </w:p>
+    <w:p>
+      <w:pPr>
+        <w:pStyle w:val="Heading3"/>
+      </w:pPr>
+      <w:r>
+        <w:t>Trajectory Generation &amp; Optimization</w:t>
+      </w:r>
+    </w:p>
+    <w:p>
+      <w:pPr>
+        <w:pStyle w:val="Heading2"/>
+      </w:pPr>
+      <w:r>
+        <w:t>Path Planning Results</w:t>
+      </w:r>
+    </w:p>
+    <w:p>
+      <w:pPr>
+        <w:pStyle w:val="Heading3"/>
+      </w:pPr>
+      <w:r>
+        <w:t>Coverage</w:t>
+      </w:r>
+    </w:p>
+    <w:p>
+      <w:pPr>
+        <w:pStyle w:val="Heading3"/>
+      </w:pPr>
+      <w:r>
+        <w:t>Travelling Time &amp; Fuel Consumption</w:t>
+      </w:r>
+    </w:p>
+    <w:p>
+      <w:pPr>
+        <w:pStyle w:val="Heading2"/>
+      </w:pPr>
+      <w:bookmarkStart w:id="8" w:name="_Ref215082070"/>
+      <w:r>
+        <w:t>Spacecraft Control</w:t>
+      </w:r>
+      <w:bookmarkEnd w:id="8"/>
+    </w:p>
+    <w:p>
+      <w:pPr>
+        <w:pStyle w:val="Heading3"/>
+      </w:pPr>
+      <w:r>
+        <w:t>Description</w:t>
+      </w:r>
+    </w:p>
+    <w:p>
+      <w:r>
+        <w:t>This section describes the low-level controller used to track viewpoint positions and attitude for our space robot. The controller is intentionally lightweight and robust. It is deployed on a 25 kg platform equipped with six face-mounted thrusters (each capped at 20 N) and three reaction wheels (each capped at 5 N·m). PD control is adopted for three main reasons:</w:t>
+      </w:r>
+    </w:p>
+    <w:p>
+      <w:pPr>
+        <w:pStyle w:val="ListParagraph"/>
+        <w:numPr>
+          <w:ilvl w:val="0"/>
+          <w:numId w:val="7"/>
+        </w:numPr>
+      </w:pPr>
+      <w:r>
+        <w:rPr>
+          <w:bCs/>
+        </w:rPr>
+        <w:t>Simplicity and robust performance:</w:t>
+      </w:r>
+      <w:r>
+        <w:t xml:space="preserve"> PD requires few parameters and avoids online optimization.</w:t>
+      </w:r>
+    </w:p>
+    <w:p>
+      <w:pPr>
+        <w:pStyle w:val="ListParagraph"/>
+        <w:numPr>
+          <w:ilvl w:val="0"/>
+          <w:numId w:val="7"/>
+        </w:numPr>
+      </w:pPr>
+      <w:r>
+        <w:rPr>
+          <w:bCs/>
+        </w:rPr>
+        <w:t>Simple Dynamics:</w:t>
+      </w:r>
+      <w:r>
+        <w:t xml:space="preserve"> Each axis is shaped as an independent second-order system, enabling easy modeling.</w:t>
+      </w:r>
+    </w:p>
+    <w:p>
+      <w:pPr>
+        <w:pStyle w:val="ListParagraph"/>
+        <w:numPr>
+          <w:ilvl w:val="0"/>
+          <w:numId w:val="7"/>
+        </w:numPr>
+      </w:pPr>
+      <w:r>
+        <w:rPr>
+          <w:bCs/>
+        </w:rPr>
+        <w:lastRenderedPageBreak/>
+        <w:t>No integral term by design:</w:t>
+      </w:r>
+      <w:r>
+        <w:t xml:space="preserve"> Under the assumption of negligible constant biases (well-aligned thrusters and wheels), steady-state errors are small enough to be ignored. This also eliminates integral windup under actuator saturation—an issue that does not arise with pure PD.</w:t>
+      </w:r>
+    </w:p>
+    <w:p>
+      <w:r>
+        <w:t>The control objective is to (i) track position/velocity in world frame using thrusters; (ii) track attitude/angular velocity using reaction wheels, given a reference input vector</w:t>
+      </w:r>
+    </w:p>
+    <w:p>
+      <m:oMathPara>
+        <m:oMathParaPr>
+          <m:jc m:val="center"/>
+        </m:oMathParaPr>
+        <m:oMath>
+          <m:r>
+            <w:rPr>
+              <w:rFonts w:ascii="Cambria Math" w:hAnsi="Cambria Math"/>
+            </w:rPr>
+            <m:t xml:space="preserve">input=[p, v, θ, w]∈ </m:t>
+          </m:r>
+          <m:sSup>
+            <m:sSupPr>
+              <m:ctrlPr>
+                <w:rPr>
+                  <w:rFonts w:ascii="Cambria Math" w:hAnsi="Cambria Math"/>
+                  <w:i/>
+                </w:rPr>
+              </m:ctrlPr>
+            </m:sSupPr>
+            <m:e>
+              <m:r>
+                <m:rPr>
+                  <m:scr m:val="double-struck"/>
+                </m:rPr>
+                <w:rPr>
+                  <w:rFonts w:ascii="Cambria Math" w:hAnsi="Cambria Math"/>
+                </w:rPr>
+                <m:t>R</m:t>
+              </m:r>
+            </m:e>
+            <m:sup>
+              <m:r>
+                <w:rPr>
+                  <w:rFonts w:ascii="Cambria Math" w:hAnsi="Cambria Math"/>
+                </w:rPr>
+                <m:t>3+3+4+3</m:t>
+              </m:r>
+            </m:sup>
+          </m:sSup>
+        </m:oMath>
+      </m:oMathPara>
+    </w:p>
+    <w:p>
+      <w:r>
+        <w:t xml:space="preserve">where </w:t>
+      </w:r>
+      <m:oMath>
+        <m:r>
+          <w:rPr>
+            <w:rFonts w:ascii="Cambria Math" w:hAnsi="Cambria Math"/>
+          </w:rPr>
+          <m:t xml:space="preserve">p, v∈ </m:t>
+        </m:r>
+        <m:sSup>
+          <m:sSupPr>
+            <m:ctrlPr>
+              <w:rPr>
+                <w:rFonts w:ascii="Cambria Math" w:hAnsi="Cambria Math"/>
+                <w:i/>
+              </w:rPr>
+            </m:ctrlPr>
+          </m:sSupPr>
+          <m:e>
+            <m:r>
+              <m:rPr>
+                <m:scr m:val="double-struck"/>
+              </m:rPr>
+              <w:rPr>
+                <w:rFonts w:ascii="Cambria Math" w:hAnsi="Cambria Math"/>
+              </w:rPr>
+              <m:t>R</m:t>
+            </m:r>
+          </m:e>
+          <m:sup>
+            <m:r>
+              <w:rPr>
+                <w:rFonts w:ascii="Cambria Math" w:hAnsi="Cambria Math"/>
+              </w:rPr>
+              <m:t>3</m:t>
+            </m:r>
+          </m:sup>
+        </m:sSup>
+      </m:oMath>
+      <w:r>
+        <w:t xml:space="preserve"> are the desired position and velocity (world frame), </w:t>
+      </w:r>
+      <m:oMath>
+        <m:r>
+          <w:rPr>
+            <w:rFonts w:ascii="Cambria Math" w:hAnsi="Cambria Math"/>
+          </w:rPr>
+          <m:t xml:space="preserve">θ∈ </m:t>
+        </m:r>
+        <m:sSup>
+          <m:sSupPr>
+            <m:ctrlPr>
+              <w:rPr>
+                <w:rFonts w:ascii="Cambria Math" w:hAnsi="Cambria Math"/>
+                <w:i/>
+              </w:rPr>
+            </m:ctrlPr>
+          </m:sSupPr>
+          <m:e>
+            <m:r>
+              <m:rPr>
+                <m:scr m:val="double-struck"/>
+              </m:rPr>
+              <w:rPr>
+                <w:rFonts w:ascii="Cambria Math" w:hAnsi="Cambria Math"/>
+              </w:rPr>
+              <m:t>R</m:t>
+            </m:r>
+          </m:e>
+          <m:sup>
+            <m:r>
+              <w:rPr>
+                <w:rFonts w:ascii="Cambria Math" w:hAnsi="Cambria Math"/>
+              </w:rPr>
+              <m:t>4</m:t>
+            </m:r>
+          </m:sup>
+        </m:sSup>
+      </m:oMath>
+      <w:r>
+        <w:t xml:space="preserve"> is the desired unit quaternion representing attitude (world frame), and </w:t>
+      </w:r>
+      <m:oMath>
+        <m:r>
+          <w:rPr>
+            <w:rFonts w:ascii="Cambria Math" w:hAnsi="Cambria Math"/>
+          </w:rPr>
+          <m:t xml:space="preserve">w∈ </m:t>
+        </m:r>
+        <m:sSup>
+          <m:sSupPr>
+            <m:ctrlPr>
+              <w:rPr>
+                <w:rFonts w:ascii="Cambria Math" w:hAnsi="Cambria Math"/>
+                <w:i/>
+              </w:rPr>
+            </m:ctrlPr>
+          </m:sSupPr>
+          <m:e>
+            <m:r>
+              <m:rPr>
+                <m:scr m:val="double-struck"/>
+              </m:rPr>
+              <w:rPr>
+                <w:rFonts w:ascii="Cambria Math" w:hAnsi="Cambria Math"/>
+              </w:rPr>
+              <m:t>R</m:t>
+            </m:r>
+          </m:e>
+          <m:sup>
+            <m:r>
+              <w:rPr>
+                <w:rFonts w:ascii="Cambria Math" w:hAnsi="Cambria Math"/>
+              </w:rPr>
+              <m:t>3+3+4+3</m:t>
+            </m:r>
+          </m:sup>
+        </m:sSup>
+      </m:oMath>
+      <w:r>
+        <w:t xml:space="preserve"> is the desired angular velocity (body frame).</w:t>
+      </w:r>
+    </w:p>
+    <w:p>
+      <w:pPr>
+        <w:pStyle w:val="Heading3"/>
+      </w:pPr>
+      <w:r>
+        <w:t>Translational PD (Acceleration)</w:t>
+      </w:r>
+    </w:p>
+    <w:p>
+      <w:r>
+        <w:t>A critically damped second-order controller is designed independently for each axis. The position and velocity tracking errors are defined as</w:t>
+      </w:r>
+    </w:p>
+    <w:p>
+      <w:pPr>
+        <w:rPr>
+          <w:rFonts w:asciiTheme="minorHAnsi" w:hAnsi="Cambria Math"/>
+          <w:lang w:bidi="ar"/>
+        </w:rPr>
+      </w:pPr>
+      <m:oMathPara>
+        <m:oMath>
+          <m:sSub>
+            <m:sSubPr>
+              <m:ctrlPr>
+                <w:rPr>
+                  <w:rFonts w:ascii="Cambria Math" w:hAnsi="Cambria Math"/>
+                  <w:i/>
+                  <w:lang w:bidi="ar"/>
+                </w:rPr>
+              </m:ctrlPr>
+            </m:sSubPr>
+            <m:e>
+              <m:r>
+                <w:rPr>
+                  <w:rFonts w:ascii="Cambria Math" w:hAnsi="Cambria Math"/>
+                  <w:lang w:bidi="ar"/>
+                </w:rPr>
+                <m:t>e</m:t>
+              </m:r>
+            </m:e>
+            <m:sub>
+              <m:r>
+                <w:rPr>
+                  <w:rFonts w:ascii="Cambria Math" w:hAnsi="Cambria Math"/>
+                  <w:lang w:bidi="ar"/>
+                </w:rPr>
+                <m:t>p</m:t>
+              </m:r>
+            </m:sub>
+          </m:sSub>
+          <m:r>
+            <w:rPr>
+              <w:rFonts w:ascii="Cambria Math" w:hAnsi="Cambria Math"/>
+              <w:lang w:bidi="ar"/>
+            </w:rPr>
+            <m:t>=p-</m:t>
+          </m:r>
+          <m:sSup>
+            <m:sSupPr>
+              <m:ctrlPr>
+                <w:rPr>
+                  <w:rFonts w:ascii="Cambria Math" w:hAnsi="Cambria Math"/>
+                  <w:i/>
+                  <w:lang w:bidi="ar"/>
+                </w:rPr>
+              </m:ctrlPr>
+            </m:sSupPr>
+            <m:e>
+              <m:r>
+                <w:rPr>
+                  <w:rFonts w:ascii="Cambria Math" w:hAnsi="Cambria Math"/>
+                  <w:lang w:bidi="ar"/>
+                </w:rPr>
+                <m:t>p</m:t>
+              </m:r>
+            </m:e>
+            <m:sup>
+              <m:r>
+                <w:rPr>
+                  <w:rFonts w:ascii="Cambria Math" w:hAnsi="Cambria Math"/>
+                  <w:lang w:bidi="ar"/>
+                </w:rPr>
+                <m:t>*</m:t>
+              </m:r>
+            </m:sup>
+          </m:sSup>
+        </m:oMath>
+      </m:oMathPara>
+    </w:p>
+    <w:p>
+      <w:pPr>
+        <w:rPr>
+          <w:rFonts w:hAnsi="Cambria Math"/>
+          <w:lang w:bidi="ar"/>
+        </w:rPr>
+      </w:pPr>
+      <m:oMathPara>
+        <m:oMath>
+          <m:sSub>
+            <m:sSubPr>
+              <m:ctrlPr>
+                <w:rPr>
+                  <w:rFonts w:ascii="Cambria Math" w:hAnsi="Cambria Math"/>
+                  <w:i/>
+                  <w:lang w:bidi="ar"/>
+                </w:rPr>
+              </m:ctrlPr>
+            </m:sSubPr>
+            <m:e>
+              <m:r>
+                <w:rPr>
+                  <w:rFonts w:ascii="Cambria Math" w:hAnsi="Cambria Math"/>
+                  <w:lang w:bidi="ar"/>
+                </w:rPr>
+                <m:t>e</m:t>
+              </m:r>
+            </m:e>
+            <m:sub>
+              <m:r>
+                <w:rPr>
+                  <w:rFonts w:ascii="Cambria Math" w:hAnsi="Cambria Math"/>
+                  <w:lang w:bidi="ar"/>
+                </w:rPr>
+                <m:t>v</m:t>
+              </m:r>
+            </m:sub>
+          </m:sSub>
+          <m:r>
+            <w:rPr>
+              <w:rFonts w:ascii="Cambria Math" w:hAnsi="Cambria Math"/>
+              <w:lang w:bidi="ar"/>
+            </w:rPr>
+            <m:t>=v-</m:t>
+          </m:r>
+          <m:sSup>
+            <m:sSupPr>
+              <m:ctrlPr>
+                <w:rPr>
+                  <w:rFonts w:ascii="Cambria Math" w:hAnsi="Cambria Math"/>
+                  <w:i/>
+                  <w:lang w:bidi="ar"/>
+                </w:rPr>
+              </m:ctrlPr>
+            </m:sSupPr>
+            <m:e>
+              <m:r>
+                <w:rPr>
+                  <w:rFonts w:ascii="Cambria Math" w:hAnsi="Cambria Math"/>
+                  <w:lang w:bidi="ar"/>
+                </w:rPr>
+                <m:t>v</m:t>
+              </m:r>
+            </m:e>
+            <m:sup>
+              <m:r>
+                <w:rPr>
+                  <w:rFonts w:ascii="Cambria Math" w:hAnsi="Cambria Math"/>
+                  <w:lang w:bidi="ar"/>
+                </w:rPr>
+                <m:t>*</m:t>
+              </m:r>
+            </m:sup>
+          </m:sSup>
+        </m:oMath>
+      </m:oMathPara>
+    </w:p>
+    <w:p>
+      <w:pPr>
+        <w:rPr>
+          <w:rFonts w:hAnsi="Cambria Math"/>
+          <w:lang w:bidi="ar"/>
+        </w:rPr>
+      </w:pPr>
+      <m:oMathPara>
+        <m:oMath>
+          <m:sSub>
+            <m:sSubPr>
+              <m:ctrlPr>
+                <w:rPr>
+                  <w:rFonts w:ascii="Cambria Math" w:hAnsi="Cambria Math"/>
+                  <w:i/>
+                  <w:lang w:bidi="ar"/>
+                </w:rPr>
+              </m:ctrlPr>
+            </m:sSubPr>
+            <m:e>
+              <m:r>
+                <w:rPr>
+                  <w:rFonts w:ascii="Cambria Math" w:hAnsi="Cambria Math"/>
+                  <w:lang w:bidi="ar"/>
+                </w:rPr>
+                <m:t>a</m:t>
+              </m:r>
+            </m:e>
+            <m:sub>
+              <m:r>
+                <w:rPr>
+                  <w:rFonts w:ascii="Cambria Math" w:hAnsi="Cambria Math"/>
+                  <w:lang w:bidi="ar"/>
+                </w:rPr>
+                <m:t>des</m:t>
+              </m:r>
+            </m:sub>
+          </m:sSub>
+          <m:r>
+            <w:rPr>
+              <w:rFonts w:ascii="Cambria Math" w:hAnsi="Cambria Math"/>
+              <w:lang w:bidi="ar"/>
+            </w:rPr>
+            <m:t>=-</m:t>
+          </m:r>
+          <m:sSub>
+            <m:sSubPr>
+              <m:ctrlPr>
+                <w:rPr>
+                  <w:rFonts w:ascii="Cambria Math" w:hAnsi="Cambria Math"/>
+                  <w:i/>
+                  <w:lang w:bidi="ar"/>
+                </w:rPr>
+              </m:ctrlPr>
+            </m:sSubPr>
+            <m:e>
+              <m:r>
+                <w:rPr>
+                  <w:rFonts w:ascii="Cambria Math" w:hAnsi="Cambria Math"/>
+                  <w:lang w:bidi="ar"/>
+                </w:rPr>
+                <m:t>k</m:t>
+              </m:r>
+            </m:e>
+            <m:sub>
+              <m:r>
+                <w:rPr>
+                  <w:rFonts w:ascii="Cambria Math" w:hAnsi="Cambria Math"/>
+                  <w:lang w:bidi="ar"/>
+                </w:rPr>
+                <m:t>p</m:t>
+              </m:r>
+            </m:sub>
+          </m:sSub>
+          <m:sSub>
+            <m:sSubPr>
+              <m:ctrlPr>
+                <w:rPr>
+                  <w:rFonts w:ascii="Cambria Math" w:hAnsi="Cambria Math"/>
+                  <w:i/>
+                  <w:lang w:bidi="ar"/>
+                </w:rPr>
+              </m:ctrlPr>
+            </m:sSubPr>
+            <m:e>
+              <m:r>
+                <w:rPr>
+                  <w:rFonts w:ascii="Cambria Math" w:hAnsi="Cambria Math"/>
+                  <w:lang w:bidi="ar"/>
+                </w:rPr>
+                <m:t>e</m:t>
+              </m:r>
+            </m:e>
+            <m:sub>
+              <m:r>
+                <w:rPr>
+                  <w:rFonts w:ascii="Cambria Math" w:hAnsi="Cambria Math"/>
+                  <w:lang w:bidi="ar"/>
+                </w:rPr>
+                <m:t>p</m:t>
+              </m:r>
+            </m:sub>
+          </m:sSub>
+          <m:r>
+            <w:rPr>
+              <w:rFonts w:ascii="Cambria Math" w:hAnsi="Cambria Math"/>
+              <w:lang w:bidi="ar"/>
+            </w:rPr>
+            <m:t>-</m:t>
+          </m:r>
+          <m:sSub>
+            <m:sSubPr>
+              <m:ctrlPr>
+                <w:rPr>
+                  <w:rFonts w:ascii="Cambria Math" w:hAnsi="Cambria Math"/>
+                  <w:i/>
+                  <w:lang w:bidi="ar"/>
+                </w:rPr>
+              </m:ctrlPr>
+            </m:sSubPr>
+            <m:e>
+              <m:r>
+                <w:rPr>
+                  <w:rFonts w:ascii="Cambria Math" w:hAnsi="Cambria Math"/>
+                  <w:lang w:bidi="ar"/>
+                </w:rPr>
+                <m:t>k</m:t>
+              </m:r>
+            </m:e>
+            <m:sub>
+              <m:r>
+                <w:rPr>
+                  <w:rFonts w:ascii="Cambria Math" w:hAnsi="Cambria Math"/>
+                  <w:lang w:bidi="ar"/>
+                </w:rPr>
+                <m:t>v</m:t>
+              </m:r>
+            </m:sub>
+          </m:sSub>
+          <m:sSub>
+            <m:sSubPr>
+              <m:ctrlPr>
+                <w:rPr>
+                  <w:rFonts w:ascii="Cambria Math" w:hAnsi="Cambria Math"/>
+                  <w:i/>
+                  <w:lang w:bidi="ar"/>
+                </w:rPr>
+              </m:ctrlPr>
+            </m:sSubPr>
+            <m:e>
+              <m:r>
+                <w:rPr>
+                  <w:rFonts w:ascii="Cambria Math" w:hAnsi="Cambria Math"/>
+                  <w:lang w:bidi="ar"/>
+                </w:rPr>
+                <m:t>e</m:t>
+              </m:r>
+            </m:e>
+            <m:sub>
+              <m:r>
+                <w:rPr>
+                  <w:rFonts w:ascii="Cambria Math" w:hAnsi="Cambria Math"/>
+                  <w:lang w:bidi="ar"/>
+                </w:rPr>
+                <m:t>v</m:t>
+              </m:r>
+            </m:sub>
+          </m:sSub>
+        </m:oMath>
+      </m:oMathPara>
+    </w:p>
+    <w:p>
+      <w:pPr>
+        <w:rPr>
+          <w:lang w:bidi="ar"/>
+        </w:rPr>
+      </w:pPr>
+      <w:r>
+        <w:rPr>
+          <w:lang w:bidi="ar"/>
+        </w:rPr>
+        <w:t xml:space="preserve">where </w:t>
+      </w:r>
+      <m:oMath>
+        <m:sSup>
+          <m:sSupPr>
+            <m:ctrlPr>
+              <w:rPr>
+                <w:rFonts w:ascii="Cambria Math" w:hAnsi="Cambria Math"/>
+                <w:lang w:bidi="ar"/>
+              </w:rPr>
+            </m:ctrlPr>
+          </m:sSupPr>
+          <m:e>
+            <m:r>
+              <m:rPr>
+                <m:sty m:val="p"/>
+              </m:rPr>
+              <w:rPr>
+                <w:rFonts w:ascii="Cambria Math" w:hAnsi="Cambria Math"/>
+                <w:lang w:bidi="ar"/>
+              </w:rPr>
+              <m:t>p</m:t>
+            </m:r>
+          </m:e>
+          <m:sup>
+            <m:r>
+              <m:rPr>
+                <m:sty m:val="p"/>
+              </m:rPr>
+              <w:rPr>
+                <w:rFonts w:ascii="Cambria Math" w:hAnsi="Cambria Math"/>
+                <w:lang w:bidi="ar"/>
+              </w:rPr>
+              <m:t>*</m:t>
+            </m:r>
+          </m:sup>
+        </m:sSup>
+      </m:oMath>
+      <w:r>
+        <w:rPr>
+          <w:lang w:bidi="ar"/>
+        </w:rPr>
+        <w:t xml:space="preserve"> and </w:t>
+      </w:r>
+      <m:oMath>
+        <m:sSup>
+          <m:sSupPr>
+            <m:ctrlPr>
+              <w:rPr>
+                <w:rFonts w:ascii="Cambria Math" w:hAnsi="Cambria Math"/>
+                <w:lang w:bidi="ar"/>
+              </w:rPr>
+            </m:ctrlPr>
+          </m:sSupPr>
+          <m:e>
+            <m:r>
+              <m:rPr>
+                <m:sty m:val="p"/>
+              </m:rPr>
+              <w:rPr>
+                <w:rFonts w:ascii="Cambria Math" w:hAnsi="Cambria Math"/>
+                <w:lang w:bidi="ar"/>
+              </w:rPr>
+              <m:t>v</m:t>
+            </m:r>
+          </m:e>
+          <m:sup>
+            <m:r>
+              <m:rPr>
+                <m:sty m:val="p"/>
+              </m:rPr>
+              <w:rPr>
+                <w:rFonts w:ascii="Cambria Math" w:hAnsi="Cambria Math"/>
+                <w:lang w:bidi="ar"/>
+              </w:rPr>
+              <m:t>*</m:t>
+            </m:r>
+          </m:sup>
+        </m:sSup>
+      </m:oMath>
+      <w:r>
+        <w:rPr>
+          <w:lang w:bidi="ar"/>
+        </w:rPr>
+        <w:t xml:space="preserve"> are the reference </w:t>
+      </w:r>
+      <w:r>
+        <w:rPr>
+          <w:rFonts w:eastAsia="SimSun"/>
+        </w:rPr>
+        <w:t>position and velocity</w:t>
+      </w:r>
+      <w:r>
+        <w:rPr>
+          <w:lang w:bidi="ar"/>
+        </w:rPr>
+        <w:t xml:space="preserve">, </w:t>
+      </w:r>
+      <m:oMath>
+        <m:sSub>
+          <m:sSubPr>
+            <m:ctrlPr>
+              <w:rPr>
+                <w:rFonts w:ascii="Cambria Math" w:hAnsi="Cambria Math"/>
+                <w:i/>
+                <w:lang w:bidi="ar"/>
+              </w:rPr>
+            </m:ctrlPr>
+          </m:sSubPr>
+          <m:e>
+            <m:r>
+              <w:rPr>
+                <w:rFonts w:ascii="Cambria Math" w:hAnsi="Cambria Math"/>
+                <w:lang w:bidi="ar"/>
+              </w:rPr>
+              <m:t>a</m:t>
+            </m:r>
+          </m:e>
+          <m:sub>
+            <m:r>
+              <w:rPr>
+                <w:rFonts w:ascii="Cambria Math" w:hAnsi="Cambria Math"/>
+                <w:lang w:bidi="ar"/>
+              </w:rPr>
+              <m:t>des</m:t>
+            </m:r>
+          </m:sub>
+        </m:sSub>
+      </m:oMath>
+      <w:r>
+        <w:rPr>
+          <w:rFonts w:hAnsi="Cambria Math"/>
+          <w:lang w:bidi="ar"/>
+        </w:rPr>
+        <w:t xml:space="preserve"> </w:t>
+      </w:r>
+      <w:r>
+        <w:rPr>
+          <w:lang w:bidi="ar"/>
+        </w:rPr>
+        <w:t xml:space="preserve">is the desired acceleration output. </w:t>
+      </w:r>
+      <w:r>
+        <w:rPr>
+          <w:rFonts w:eastAsia="SimSun"/>
+        </w:rPr>
+        <w:t>For each axis, the closed-loop dynamics are modeled as a standard second-order system</w:t>
+      </w:r>
+    </w:p>
+    <w:p>
+      <w:pPr>
+        <w:rPr>
+          <w:rFonts w:asciiTheme="minorHAnsi" w:hAnsi="Cambria Math"/>
+          <w:lang w:bidi="ar"/>
+        </w:rPr>
+      </w:pPr>
+      <m:oMath>
+        <m:acc>
+          <m:accPr>
+            <m:chr m:val="̈"/>
+            <m:ctrlPr>
+              <w:rPr>
+                <w:rFonts w:ascii="Cambria Math" w:hAnsi="Cambria Math"/>
+                <w:i/>
+                <w:lang w:bidi="ar"/>
+              </w:rPr>
+            </m:ctrlPr>
+          </m:accPr>
+          <m:e>
+            <m:r>
+              <w:rPr>
+                <w:rFonts w:ascii="Cambria Math" w:hAnsi="Cambria Math"/>
+                <w:lang w:bidi="ar"/>
+              </w:rPr>
+              <m:t>x</m:t>
+            </m:r>
+          </m:e>
+        </m:acc>
+        <m:r>
+          <w:rPr>
+            <w:rFonts w:ascii="Cambria Math" w:hAnsi="Cambria Math"/>
+            <w:lang w:bidi="ar"/>
+          </w:rPr>
+          <m:t>+</m:t>
+        </m:r>
+        <m:f>
+          <m:fPr>
+            <m:ctrlPr>
+              <w:rPr>
+                <w:rFonts w:ascii="Cambria Math" w:hAnsi="Cambria Math"/>
+                <w:i/>
+                <w:lang w:bidi="ar"/>
+              </w:rPr>
+            </m:ctrlPr>
+          </m:fPr>
+          <m:num>
+            <m:sSub>
+              <m:sSubPr>
+                <m:ctrlPr>
+                  <w:rPr>
+                    <w:rFonts w:ascii="Cambria Math" w:hAnsi="Cambria Math"/>
+                    <w:i/>
+                    <w:lang w:bidi="ar"/>
+                  </w:rPr>
+                </m:ctrlPr>
+              </m:sSubPr>
+              <m:e>
+                <m:r>
+                  <w:rPr>
+                    <w:rFonts w:ascii="Cambria Math" w:hAnsi="Cambria Math"/>
+                    <w:lang w:bidi="ar"/>
+                  </w:rPr>
+                  <m:t>k</m:t>
+                </m:r>
+              </m:e>
+              <m:sub>
+                <m:r>
+                  <w:rPr>
+                    <w:rFonts w:ascii="Cambria Math" w:hAnsi="Cambria Math"/>
+                    <w:lang w:bidi="ar"/>
+                  </w:rPr>
+                  <m:t>v</m:t>
+                </m:r>
+              </m:sub>
+            </m:sSub>
+          </m:num>
+          <m:den>
+            <m:r>
+              <w:rPr>
+                <w:rFonts w:ascii="Cambria Math" w:hAnsi="Cambria Math"/>
+                <w:lang w:bidi="ar"/>
+              </w:rPr>
+              <m:t>m</m:t>
+            </m:r>
+          </m:den>
+        </m:f>
+        <m:acc>
+          <m:accPr>
+            <m:chr m:val="̇"/>
+            <m:ctrlPr>
+              <w:rPr>
+                <w:rFonts w:ascii="Cambria Math" w:hAnsi="Cambria Math"/>
+                <w:i/>
+                <w:lang w:bidi="ar"/>
+              </w:rPr>
+            </m:ctrlPr>
+          </m:accPr>
+          <m:e>
+            <m:r>
+              <w:rPr>
+                <w:rFonts w:ascii="Cambria Math" w:hAnsi="Cambria Math"/>
+                <w:lang w:bidi="ar"/>
+              </w:rPr>
+              <m:t>x</m:t>
+            </m:r>
+          </m:e>
+        </m:acc>
+        <m:r>
+          <w:rPr>
+            <w:rFonts w:ascii="Cambria Math" w:hAnsi="Cambria Math"/>
+            <w:lang w:bidi="ar"/>
+          </w:rPr>
+          <m:t>+</m:t>
+        </m:r>
+        <m:f>
+          <m:fPr>
+            <m:ctrlPr>
+              <w:rPr>
+                <w:rFonts w:ascii="Cambria Math" w:hAnsi="Cambria Math"/>
+                <w:i/>
+                <w:lang w:bidi="ar"/>
+              </w:rPr>
+            </m:ctrlPr>
+          </m:fPr>
+          <m:num>
+            <m:sSub>
+              <m:sSubPr>
+                <m:ctrlPr>
+                  <w:rPr>
+                    <w:rFonts w:ascii="Cambria Math" w:hAnsi="Cambria Math"/>
+                    <w:i/>
+                    <w:lang w:bidi="ar"/>
+                  </w:rPr>
+                </m:ctrlPr>
+              </m:sSubPr>
+              <m:e>
+                <m:r>
+                  <w:rPr>
+                    <w:rFonts w:ascii="Cambria Math" w:hAnsi="Cambria Math"/>
+                    <w:lang w:bidi="ar"/>
+                  </w:rPr>
+                  <m:t>k</m:t>
+                </m:r>
+              </m:e>
+              <m:sub>
+                <m:r>
+                  <w:rPr>
+                    <w:rFonts w:ascii="Cambria Math" w:hAnsi="Cambria Math"/>
+                    <w:lang w:bidi="ar"/>
+                  </w:rPr>
+                  <m:t>p</m:t>
+                </m:r>
+              </m:sub>
+            </m:sSub>
+          </m:num>
+          <m:den>
+            <m:r>
+              <w:rPr>
+                <w:rFonts w:ascii="Cambria Math" w:hAnsi="Cambria Math"/>
+                <w:lang w:bidi="ar"/>
+              </w:rPr>
+              <m:t>m</m:t>
+            </m:r>
+          </m:den>
+        </m:f>
+        <m:r>
+          <w:rPr>
+            <w:rFonts w:ascii="Cambria Math" w:hAnsi="Cambria Math"/>
+            <w:lang w:bidi="ar"/>
+          </w:rPr>
+          <m:t>x=0</m:t>
+        </m:r>
+      </m:oMath>
+      <w:r>
+        <w:rPr>
+          <w:rFonts w:hAnsi="Cambria Math"/>
+          <w:lang w:bidi="ar"/>
+        </w:rPr>
+        <w:t xml:space="preserve"> , </w:t>
+      </w:r>
+      <m:oMath>
+        <m:d>
+          <m:dPr>
+            <m:begChr m:val="{"/>
+            <m:endChr m:val=""/>
+            <m:ctrlPr>
+              <w:rPr>
+                <w:rFonts w:ascii="Cambria Math" w:hAnsi="Cambria Math"/>
+                <w:i/>
+                <w:lang w:bidi="ar"/>
+              </w:rPr>
+            </m:ctrlPr>
+          </m:dPr>
+          <m:e>
+            <m:eqArr>
+              <m:eqArrPr>
+                <m:ctrlPr>
+                  <w:rPr>
+                    <w:rFonts w:ascii="Cambria Math" w:hAnsi="Cambria Math"/>
+                    <w:i/>
+                    <w:lang w:bidi="ar"/>
+                  </w:rPr>
+                </m:ctrlPr>
+              </m:eqArrPr>
+              <m:e>
+                <m:sSub>
+                  <m:sSubPr>
+                    <m:ctrlPr>
+                      <w:rPr>
+                        <w:rFonts w:ascii="Cambria Math" w:hAnsi="Cambria Math"/>
+                        <w:i/>
+                        <w:lang w:bidi="ar"/>
+                      </w:rPr>
+                    </m:ctrlPr>
+                  </m:sSubPr>
+                  <m:e>
+                    <m:r>
+                      <w:rPr>
+                        <w:rFonts w:ascii="Cambria Math" w:hAnsi="Cambria Math"/>
+                        <w:lang w:bidi="ar"/>
+                      </w:rPr>
+                      <m:t>k</m:t>
+                    </m:r>
+                  </m:e>
+                  <m:sub>
+                    <m:r>
+                      <w:rPr>
+                        <w:rFonts w:ascii="Cambria Math" w:hAnsi="Cambria Math"/>
+                        <w:lang w:bidi="ar"/>
+                      </w:rPr>
+                      <m:t>p</m:t>
+                    </m:r>
+                  </m:sub>
+                </m:sSub>
+                <m:r>
+                  <w:rPr>
+                    <w:rFonts w:ascii="Cambria Math" w:hAnsi="Cambria Math"/>
+                    <w:lang w:bidi="ar"/>
+                  </w:rPr>
+                  <m:t>=m</m:t>
+                </m:r>
+                <m:sSubSup>
+                  <m:sSubSupPr>
+                    <m:ctrlPr>
+                      <w:rPr>
+                        <w:rFonts w:ascii="Cambria Math" w:hAnsi="Cambria Math"/>
+                        <w:i/>
+                        <w:lang w:bidi="ar"/>
+                      </w:rPr>
+                    </m:ctrlPr>
+                  </m:sSubSupPr>
+                  <m:e>
+                    <m:r>
+                      <w:rPr>
+                        <w:rFonts w:ascii="Cambria Math" w:hAnsi="Cambria Math"/>
+                        <w:lang w:bidi="ar"/>
+                      </w:rPr>
+                      <m:t>w</m:t>
+                    </m:r>
+                  </m:e>
+                  <m:sub>
+                    <m:r>
+                      <w:rPr>
+                        <w:rFonts w:ascii="Cambria Math" w:hAnsi="Cambria Math"/>
+                        <w:lang w:bidi="ar"/>
+                      </w:rPr>
+                      <m:t>n</m:t>
+                    </m:r>
+                  </m:sub>
+                  <m:sup>
+                    <m:r>
+                      <w:rPr>
+                        <w:rFonts w:ascii="Cambria Math" w:hAnsi="Cambria Math"/>
+                        <w:lang w:bidi="ar"/>
+                      </w:rPr>
+                      <m:t>2</m:t>
+                    </m:r>
+                  </m:sup>
+                </m:sSubSup>
+              </m:e>
+              <m:e>
+                <m:sSub>
+                  <m:sSubPr>
+                    <m:ctrlPr>
+                      <w:rPr>
+                        <w:rFonts w:ascii="Cambria Math" w:hAnsi="Cambria Math"/>
+                        <w:i/>
+                        <w:lang w:bidi="ar"/>
+                      </w:rPr>
+                    </m:ctrlPr>
+                  </m:sSubPr>
+                  <m:e>
+                    <m:r>
+                      <w:rPr>
+                        <w:rFonts w:ascii="Cambria Math" w:hAnsi="Cambria Math"/>
+                        <w:lang w:bidi="ar"/>
+                      </w:rPr>
+                      <m:t>k</m:t>
+                    </m:r>
+                  </m:e>
+                  <m:sub>
+                    <m:r>
+                      <w:rPr>
+                        <w:rFonts w:ascii="Cambria Math" w:hAnsi="Cambria Math"/>
+                        <w:lang w:bidi="ar"/>
+                      </w:rPr>
+                      <m:t>v</m:t>
+                    </m:r>
+                  </m:sub>
+                </m:sSub>
+                <m:r>
+                  <w:rPr>
+                    <w:rFonts w:ascii="Cambria Math" w:hAnsi="Cambria Math"/>
+                    <w:lang w:bidi="ar"/>
+                  </w:rPr>
+                  <m:t>=2mζ</m:t>
+                </m:r>
+                <m:sSub>
+                  <m:sSubPr>
+                    <m:ctrlPr>
+                      <w:rPr>
+                        <w:rFonts w:ascii="Cambria Math" w:hAnsi="Cambria Math"/>
+                        <w:i/>
+                        <w:lang w:bidi="ar"/>
+                      </w:rPr>
+                    </m:ctrlPr>
+                  </m:sSubPr>
+                  <m:e>
+                    <m:r>
+                      <w:rPr>
+                        <w:rFonts w:ascii="Cambria Math" w:hAnsi="Cambria Math"/>
+                        <w:lang w:bidi="ar"/>
+                      </w:rPr>
+                      <m:t>w</m:t>
+                    </m:r>
+                  </m:e>
+                  <m:sub>
+                    <m:r>
+                      <w:rPr>
+                        <w:rFonts w:ascii="Cambria Math" w:hAnsi="Cambria Math"/>
+                        <w:lang w:bidi="ar"/>
+                      </w:rPr>
+                      <m:t>n</m:t>
+                    </m:r>
+                  </m:sub>
+                </m:sSub>
+              </m:e>
+            </m:eqArr>
+          </m:e>
+        </m:d>
+      </m:oMath>
+      <w:r>
+        <w:rPr>
+          <w:rFonts w:hAnsi="Cambria Math"/>
+          <w:lang w:bidi="ar"/>
+        </w:rPr>
+        <w:t>, w</w:t>
+      </w:r>
+      <w:r>
+        <w:rPr>
+          <w:lang w:bidi="ar"/>
+        </w:rPr>
+        <w:t xml:space="preserve">here for critical-damped, </w:t>
+      </w:r>
+      <m:oMath>
+        <m:r>
+          <w:rPr>
+            <w:rFonts w:ascii="Cambria Math" w:hAnsi="Cambria Math"/>
+            <w:lang w:bidi="ar"/>
+          </w:rPr>
+          <m:t>ζ</m:t>
+        </m:r>
+        <m:sSub>
+          <m:sSubPr>
+            <m:ctrlPr>
+              <w:rPr>
+                <w:rFonts w:ascii="Cambria Math" w:hAnsi="Cambria Math"/>
+                <w:i/>
+                <w:lang w:bidi="ar"/>
+              </w:rPr>
+            </m:ctrlPr>
+          </m:sSubPr>
+          <m:e>
+            <m:r>
+              <w:rPr>
+                <w:rFonts w:ascii="Cambria Math" w:hAnsi="Cambria Math"/>
+                <w:lang w:bidi="ar"/>
+              </w:rPr>
+              <m:t>=w</m:t>
+            </m:r>
+          </m:e>
+          <m:sub>
+            <m:r>
+              <w:rPr>
+                <w:rFonts w:ascii="Cambria Math" w:hAnsi="Cambria Math"/>
+                <w:lang w:bidi="ar"/>
+              </w:rPr>
+              <m:t>n</m:t>
+            </m:r>
+          </m:sub>
+        </m:sSub>
+        <m:r>
+          <w:rPr>
+            <w:rFonts w:ascii="Cambria Math" w:hAnsi="Cambria Math"/>
+            <w:lang w:bidi="ar"/>
+          </w:rPr>
+          <m:t>=1</m:t>
+        </m:r>
+      </m:oMath>
+    </w:p>
+    <w:p>
+      <w:pPr>
+        <w:rPr>
+          <w:rFonts w:hAnsi="Cambria Math"/>
+          <w:lang w:bidi="ar"/>
+        </w:rPr>
+      </w:pPr>
+      <w:r>
+        <w:rPr>
+          <w:lang w:bidi="ar"/>
+        </w:rPr>
+        <w:t xml:space="preserve">with </w:t>
+      </w:r>
+      <m:oMath>
+        <m:r>
+          <w:rPr>
+            <w:rFonts w:ascii="Cambria Math"/>
+            <w:lang w:bidi="ar"/>
+          </w:rPr>
+          <m:t>m</m:t>
+        </m:r>
+        <m:r>
+          <w:rPr>
+            <w:rFonts w:ascii="Cambria Math" w:hAnsi="Cambria Math"/>
+            <w:lang w:bidi="ar"/>
+          </w:rPr>
+          <m:t>=25kg</m:t>
+        </m:r>
+      </m:oMath>
+      <w:r>
+        <w:rPr>
+          <w:lang w:bidi="ar"/>
+        </w:rPr>
+        <w:t xml:space="preserve">, </w:t>
+      </w:r>
+      <w:r>
+        <w:rPr>
+          <w:rFonts w:eastAsia="SimSun"/>
+        </w:rPr>
+        <w:t>this yields</w:t>
+      </w:r>
+      <w:r>
+        <w:rPr>
+          <w:lang w:bidi="ar"/>
+        </w:rPr>
+        <w:t xml:space="preserve"> </w:t>
+      </w:r>
+      <m:oMath>
+        <m:sSub>
+          <m:sSubPr>
+            <m:ctrlPr>
+              <w:rPr>
+                <w:rFonts w:ascii="Cambria Math" w:hAnsi="Cambria Math"/>
+                <w:i/>
+                <w:lang w:bidi="ar"/>
+              </w:rPr>
+            </m:ctrlPr>
+          </m:sSubPr>
+          <m:e>
+            <m:r>
+              <m:rPr>
+                <m:nor/>
+              </m:rPr>
+              <w:rPr>
+                <w:i/>
+                <w:lang w:bidi="ar"/>
+              </w:rPr>
+              <m:t>k</m:t>
+            </m:r>
+          </m:e>
+          <m:sub>
+            <m:r>
+              <m:rPr>
+                <m:nor/>
+              </m:rPr>
+              <w:rPr>
+                <w:i/>
+                <w:lang w:bidi="ar"/>
+              </w:rPr>
+              <m:t>p</m:t>
+            </m:r>
+          </m:sub>
+        </m:sSub>
+        <m:r>
+          <w:rPr>
+            <w:rFonts w:ascii="Cambria Math" w:hAnsi="Cambria Math"/>
+            <w:lang w:bidi="ar"/>
+          </w:rPr>
+          <m:t>=25</m:t>
+        </m:r>
+      </m:oMath>
+      <w:r>
+        <w:rPr>
+          <w:rFonts w:hAnsi="Cambria Math"/>
+          <w:lang w:bidi="ar"/>
+        </w:rPr>
+        <w:t xml:space="preserve"> </w:t>
+      </w:r>
+      <w:r>
+        <w:rPr>
+          <w:lang w:bidi="ar"/>
+        </w:rPr>
+        <w:t xml:space="preserve">and </w:t>
+      </w:r>
+      <m:oMath>
+        <m:sSub>
+          <m:sSubPr>
+            <m:ctrlPr>
+              <w:rPr>
+                <w:rFonts w:ascii="Cambria Math" w:hAnsi="Cambria Math"/>
+                <w:i/>
+                <w:lang w:bidi="ar"/>
+              </w:rPr>
+            </m:ctrlPr>
+          </m:sSubPr>
+          <m:e>
+            <m:r>
+              <m:rPr>
+                <m:nor/>
+              </m:rPr>
+              <w:rPr>
+                <w:i/>
+                <w:lang w:bidi="ar"/>
+              </w:rPr>
+              <m:t>k</m:t>
+            </m:r>
+          </m:e>
+          <m:sub>
+            <m:r>
+              <m:rPr>
+                <m:nor/>
+              </m:rPr>
+              <w:rPr>
+                <w:i/>
+                <w:lang w:bidi="ar"/>
+              </w:rPr>
+              <m:t>v</m:t>
+            </m:r>
+          </m:sub>
+        </m:sSub>
+        <m:r>
+          <w:rPr>
+            <w:rFonts w:ascii="Cambria Math" w:hAnsi="Cambria Math"/>
+            <w:lang w:bidi="ar"/>
+          </w:rPr>
+          <m:t>=50</m:t>
+        </m:r>
+      </m:oMath>
+      <w:r>
+        <w:rPr>
+          <w:rFonts w:hAnsi="Cambria Math"/>
+          <w:lang w:bidi="ar"/>
+        </w:rPr>
+        <w:t>.</w:t>
+      </w:r>
+    </w:p>
+    <w:p>
+      <w:pPr>
+        <w:pStyle w:val="Heading3"/>
+        <w:rPr>
+          <w:lang w:bidi="ar"/>
+        </w:rPr>
+      </w:pPr>
+      <w:r>
+        <w:rPr>
+          <w:lang w:bidi="ar"/>
+        </w:rPr>
+        <w:t>Attitude PD (Quaternion Error)</w:t>
+      </w:r>
+    </w:p>
+    <w:p>
+      <w:pPr>
+        <w:rPr>
+          <w:rFonts w:eastAsia="SimSun"/>
+        </w:rPr>
+      </w:pPr>
+      <w:r>
+        <w:rPr>
+          <w:rFonts w:eastAsia="SimSun"/>
+        </w:rPr>
+        <w:t>Similar to the translational PD controller, we define the angular-velocity error as</w:t>
+      </w:r>
+    </w:p>
+    <w:p>
+      <w:pPr>
+        <w:rPr>
+          <w:rFonts w:asciiTheme="minorHAnsi" w:hAnsi="Cambria Math"/>
+          <w:lang w:bidi="ar"/>
+        </w:rPr>
+      </w:pPr>
+      <m:oMathPara>
+        <m:oMath>
+          <m:sSub>
+            <m:sSubPr>
+              <m:ctrlPr>
+                <w:rPr>
+                  <w:rFonts w:ascii="Cambria Math" w:hAnsi="Cambria Math"/>
+                  <w:i/>
+                  <w:lang w:bidi="ar"/>
+                </w:rPr>
+              </m:ctrlPr>
+            </m:sSubPr>
+            <m:e>
+              <m:r>
+                <m:rPr>
+                  <m:nor/>
+                </m:rPr>
+                <w:rPr>
+                  <w:i/>
+                  <w:lang w:bidi="ar"/>
+                </w:rPr>
+                <m:t>e</m:t>
+              </m:r>
+            </m:e>
+            <m:sub>
+              <m:r>
+                <m:rPr>
+                  <m:nor/>
+                </m:rPr>
+                <w:rPr>
+                  <w:i/>
+                  <w:lang w:bidi="ar"/>
+                </w:rPr>
+                <m:t>w</m:t>
+              </m:r>
+            </m:sub>
+          </m:sSub>
+          <m:r>
+            <w:rPr>
+              <w:rFonts w:ascii="Cambria Math" w:hAnsi="Cambria Math"/>
+              <w:lang w:bidi="ar"/>
+            </w:rPr>
+            <m:t>=w-</m:t>
+          </m:r>
+          <m:sSup>
+            <m:sSupPr>
+              <m:ctrlPr>
+                <w:rPr>
+                  <w:rFonts w:ascii="Cambria Math" w:hAnsi="Cambria Math"/>
+                  <w:i/>
+                  <w:lang w:bidi="ar"/>
+                </w:rPr>
+              </m:ctrlPr>
+            </m:sSupPr>
+            <m:e>
+              <m:r>
+                <w:rPr>
+                  <w:rFonts w:ascii="Cambria Math" w:hAnsi="Cambria Math"/>
+                  <w:lang w:bidi="ar"/>
+                </w:rPr>
+                <m:t>w</m:t>
+              </m:r>
+            </m:e>
+            <m:sup>
+              <m:r>
+                <w:rPr>
+                  <w:rFonts w:ascii="Cambria Math" w:hAnsi="Cambria Math"/>
+                  <w:lang w:bidi="ar"/>
+                </w:rPr>
+                <m:t>*</m:t>
+              </m:r>
+            </m:sup>
+          </m:sSup>
+        </m:oMath>
+      </m:oMathPara>
+    </w:p>
+    <w:p>
+      <w:r>
+        <w:rPr>
+          <w:rFonts w:eastAsia="SimSun"/>
+        </w:rPr>
+        <w:t xml:space="preserve">where </w:t>
+      </w:r>
+      <m:oMath>
+        <m:sSup>
+          <m:sSupPr>
+            <m:ctrlPr>
+              <w:rPr>
+                <w:rFonts w:ascii="Cambria Math" w:hAnsi="Cambria Math"/>
+                <w:i/>
+                <w:lang w:bidi="ar"/>
+              </w:rPr>
+            </m:ctrlPr>
+          </m:sSupPr>
+          <m:e>
+            <m:r>
+              <w:rPr>
+                <w:rFonts w:ascii="Cambria Math" w:hAnsi="Cambria Math"/>
+                <w:lang w:bidi="ar"/>
+              </w:rPr>
+              <m:t>w</m:t>
+            </m:r>
+          </m:e>
+          <m:sup>
+            <m:r>
+              <w:rPr>
+                <w:rFonts w:ascii="Cambria Math" w:hAnsi="Cambria Math"/>
+                <w:lang w:bidi="ar"/>
+              </w:rPr>
+              <m:t>*</m:t>
+            </m:r>
+          </m:sup>
+        </m:sSup>
+      </m:oMath>
+      <w:r>
+        <w:rPr>
+          <w:rFonts w:hAnsi="Cambria Math"/>
+          <w:lang w:bidi="ar"/>
+        </w:rPr>
+        <w:t xml:space="preserve"> </w:t>
+      </w:r>
+      <w:r>
+        <w:rPr>
+          <w:rFonts w:eastAsia="SimSun"/>
+        </w:rPr>
+        <w:t>is the reference angular velocity. The attitude error is first expressed as a quaternion</w:t>
+      </w:r>
+      <w:r>
+        <w:t xml:space="preserve"> error</w:t>
+      </w:r>
+    </w:p>
+    <w:p>
+      <m:oMathPara>
+        <m:oMath>
+          <m:sSub>
+            <m:sSubPr>
+              <m:ctrlPr>
+                <w:rPr>
+                  <w:rFonts w:ascii="Cambria Math" w:hAnsi="Cambria Math"/>
+                  <w:i/>
+                  <w:lang w:bidi="ar"/>
+                </w:rPr>
+              </m:ctrlPr>
+            </m:sSubPr>
+            <m:e>
+              <m:r>
+                <w:rPr>
+                  <w:rFonts w:ascii="Cambria Math" w:hAnsi="Cambria Math"/>
+                  <w:lang w:bidi="ar"/>
+                </w:rPr>
+                <m:t>e</m:t>
+              </m:r>
+            </m:e>
+            <m:sub>
+              <m:r>
+                <w:rPr>
+                  <w:rFonts w:ascii="Cambria Math" w:hAnsi="Cambria Math"/>
+                  <w:lang w:bidi="ar"/>
+                </w:rPr>
+                <m:t>q</m:t>
+              </m:r>
+            </m:sub>
+          </m:sSub>
+          <m:r>
+            <w:rPr>
+              <w:rFonts w:ascii="Cambria Math" w:hAnsi="Cambria Math"/>
+              <w:lang w:bidi="ar"/>
+            </w:rPr>
+            <m:t>=</m:t>
+          </m:r>
+          <m:sSup>
+            <m:sSupPr>
+              <m:ctrlPr>
+                <w:rPr>
+                  <w:rFonts w:ascii="Cambria Math" w:hAnsi="Cambria Math"/>
+                  <w:i/>
+                  <w:lang w:bidi="ar"/>
+                </w:rPr>
+              </m:ctrlPr>
+            </m:sSupPr>
+            <m:e>
+              <m:r>
+                <w:rPr>
+                  <w:rFonts w:ascii="Cambria Math" w:hAnsi="Cambria Math"/>
+                  <w:lang w:bidi="ar"/>
+                </w:rPr>
+                <m:t>q</m:t>
+              </m:r>
+            </m:e>
+            <m:sup>
+              <m:r>
+                <w:rPr>
+                  <w:rFonts w:ascii="Cambria Math" w:hAnsi="Cambria Math"/>
+                  <w:lang w:bidi="ar"/>
+                </w:rPr>
+                <m:t>*</m:t>
+              </m:r>
+            </m:sup>
+          </m:sSup>
+          <m:r>
+            <w:rPr>
+              <w:rFonts w:ascii="Cambria Math" w:hAnsi="Cambria Math" w:cs="Cambria Math"/>
+              <w:lang w:bidi="ar"/>
+            </w:rPr>
+            <m:t>⨀</m:t>
+          </m:r>
+          <m:sSup>
+            <m:sSupPr>
+              <m:ctrlPr>
+                <w:rPr>
+                  <w:rFonts w:ascii="Cambria Math" w:hAnsi="Cambria Math" w:cs="Cambria Math"/>
+                  <w:i/>
+                  <w:lang w:bidi="ar"/>
+                </w:rPr>
+              </m:ctrlPr>
+            </m:sSupPr>
+            <m:e>
+              <m:r>
+                <w:rPr>
+                  <w:rFonts w:ascii="Cambria Math" w:hAnsi="Cambria Math" w:cs="Cambria Math"/>
+                  <w:lang w:bidi="ar"/>
+                </w:rPr>
+                <m:t>q</m:t>
+              </m:r>
+            </m:e>
+            <m:sup>
+              <m:r>
+                <w:rPr>
+                  <w:rFonts w:ascii="Cambria Math" w:hAnsi="Cambria Math" w:cs="Cambria Math"/>
+                  <w:lang w:bidi="ar"/>
+                </w:rPr>
+                <m:t>-1</m:t>
+              </m:r>
+            </m:sup>
+          </m:sSup>
+        </m:oMath>
+      </m:oMathPara>
+    </w:p>
+    <w:p>
+      <w:pPr>
+        <w:rPr>
+          <w:lang w:bidi="ar"/>
+        </w:rPr>
+      </w:pPr>
+      <w:r>
+        <w:rPr>
+          <w:lang w:bidi="ar"/>
+        </w:rPr>
+        <w:t xml:space="preserve">where </w:t>
+      </w:r>
+      <m:oMath>
+        <m:sSup>
+          <m:sSupPr>
+            <m:ctrlPr>
+              <w:rPr>
+                <w:rFonts w:ascii="Cambria Math" w:hAnsi="Cambria Math"/>
+                <w:i/>
+                <w:lang w:bidi="ar"/>
+              </w:rPr>
+            </m:ctrlPr>
+          </m:sSupPr>
+          <m:e>
+            <m:r>
+              <w:rPr>
+                <w:rFonts w:ascii="Cambria Math" w:hAnsi="Cambria Math"/>
+                <w:lang w:bidi="ar"/>
+              </w:rPr>
+              <m:t>q</m:t>
+            </m:r>
+          </m:e>
+          <m:sup>
+            <m:r>
+              <w:rPr>
+                <w:rFonts w:ascii="Cambria Math" w:hAnsi="Cambria Math"/>
+                <w:lang w:bidi="ar"/>
+              </w:rPr>
+              <m:t>*</m:t>
+            </m:r>
+          </m:sup>
+        </m:sSup>
+      </m:oMath>
+      <w:r>
+        <w:rPr>
+          <w:lang w:bidi="ar"/>
+        </w:rPr>
+        <w:t xml:space="preserve"> is the reference quaternion, </w:t>
+      </w:r>
+      <m:oMath>
+        <m:r>
+          <w:rPr>
+            <w:rFonts w:ascii="Cambria Math" w:hAnsi="Cambria Math" w:cs="Cambria Math"/>
+            <w:lang w:bidi="ar"/>
+          </w:rPr>
+          <m:t>⨀</m:t>
+        </m:r>
+      </m:oMath>
+      <w:r>
+        <w:rPr>
+          <w:rFonts w:hAnsi="Cambria Math" w:cs="Cambria Math"/>
+          <w:lang w:bidi="ar"/>
+        </w:rPr>
+        <w:t xml:space="preserve"> </w:t>
+      </w:r>
+      <w:r>
+        <w:rPr>
+          <w:rFonts w:eastAsia="SimSun"/>
+        </w:rPr>
+        <w:t xml:space="preserve">denotes the quaternion (Hamilton) product, </w:t>
+      </w:r>
+      <w:r>
+        <w:rPr>
+          <w:lang w:bidi="ar"/>
+        </w:rPr>
+        <w:t xml:space="preserve">and </w:t>
+      </w:r>
+      <m:oMath>
+        <m:sSup>
+          <m:sSupPr>
+            <m:ctrlPr>
+              <w:rPr>
+                <w:rFonts w:ascii="Cambria Math" w:hAnsi="Cambria Math" w:cs="Cambria Math"/>
+                <w:i/>
+                <w:lang w:bidi="ar"/>
+              </w:rPr>
+            </m:ctrlPr>
+          </m:sSupPr>
+          <m:e>
+            <m:r>
+              <w:rPr>
+                <w:rFonts w:ascii="Cambria Math" w:hAnsi="Cambria Math" w:cs="Cambria Math"/>
+                <w:lang w:bidi="ar"/>
+              </w:rPr>
+              <m:t>q</m:t>
+            </m:r>
+          </m:e>
+          <m:sup>
+            <m:r>
+              <w:rPr>
+                <w:rFonts w:ascii="Cambria Math" w:hAnsi="Cambria Math" w:cs="Cambria Math"/>
+                <w:lang w:bidi="ar"/>
+              </w:rPr>
+              <m:t>-1</m:t>
+            </m:r>
+          </m:sup>
+        </m:sSup>
+      </m:oMath>
+      <w:r>
+        <w:rPr>
+          <w:lang w:bidi="ar"/>
+        </w:rPr>
+        <w:t xml:space="preserve"> is the conjugate of current quaternion. We then map the quaternion error to a 3-D attitude error vector via</w:t>
+      </w:r>
+    </w:p>
+    <w:p>
+      <w:pPr>
+        <w:rPr>
+          <w:lang w:bidi="ar"/>
+        </w:rPr>
+      </w:pPr>
+      <m:oMathPara>
+        <m:oMath>
+          <m:sSub>
+            <m:sSubPr>
+              <m:ctrlPr>
+                <w:rPr>
+                  <w:rFonts w:ascii="Cambria Math" w:hAnsi="Cambria Math"/>
+                  <w:i/>
+                  <w:lang w:bidi="ar"/>
+                </w:rPr>
+              </m:ctrlPr>
+            </m:sSubPr>
+            <m:e>
+              <m:r>
+                <w:rPr>
+                  <w:rFonts w:ascii="Cambria Math" w:hAnsi="Cambria Math"/>
+                  <w:lang w:bidi="ar"/>
+                </w:rPr>
+                <m:t>e</m:t>
+              </m:r>
+            </m:e>
+            <m:sub>
+              <m:r>
+                <w:rPr>
+                  <w:rFonts w:ascii="Cambria Math" w:hAnsi="Cambria Math"/>
+                  <w:lang w:bidi="ar"/>
+                </w:rPr>
+                <m:t>R</m:t>
+              </m:r>
+            </m:sub>
+          </m:sSub>
+          <m:r>
+            <w:rPr>
+              <w:rFonts w:ascii="Cambria Math" w:hAnsi="Cambria Math"/>
+              <w:lang w:bidi="ar"/>
+            </w:rPr>
+            <m:t>=2</m:t>
+          </m:r>
+          <m:sSub>
+            <m:sSubPr>
+              <m:ctrlPr>
+                <w:rPr>
+                  <w:rFonts w:ascii="Cambria Math" w:hAnsi="Cambria Math"/>
+                  <w:i/>
+                  <w:lang w:bidi="ar"/>
+                </w:rPr>
+              </m:ctrlPr>
+            </m:sSubPr>
+            <m:e>
+              <m:r>
+                <w:rPr>
+                  <w:rFonts w:ascii="Cambria Math" w:hAnsi="Cambria Math"/>
+                  <w:lang w:bidi="ar"/>
+                </w:rPr>
+                <m:t>q</m:t>
+              </m:r>
+            </m:e>
+            <m:sub>
+              <m:r>
+                <w:rPr>
+                  <w:rFonts w:ascii="Cambria Math" w:hAnsi="Cambria Math"/>
+                  <w:lang w:bidi="ar"/>
+                </w:rPr>
+                <m:t>v</m:t>
+              </m:r>
+            </m:sub>
+          </m:sSub>
+        </m:oMath>
+      </m:oMathPara>
+    </w:p>
+    <w:p>
+      <w:pPr>
+        <w:rPr>
+          <w:lang w:bidi="ar"/>
+        </w:rPr>
+      </w:pPr>
+      <w:r>
+        <w:rPr>
+          <w:lang w:bidi="ar"/>
+        </w:rPr>
+        <w:t xml:space="preserve">where </w:t>
+      </w:r>
+      <m:oMath>
+        <m:sSub>
+          <m:sSubPr>
+            <m:ctrlPr>
+              <w:rPr>
+                <w:rFonts w:ascii="Cambria Math" w:hAnsi="Cambria Math"/>
+                <w:i/>
+                <w:lang w:bidi="ar"/>
+              </w:rPr>
+            </m:ctrlPr>
+          </m:sSubPr>
+          <m:e>
+            <m:r>
+              <w:rPr>
+                <w:rFonts w:ascii="Cambria Math" w:hAnsi="Cambria Math"/>
+                <w:lang w:bidi="ar"/>
+              </w:rPr>
+              <m:t>q</m:t>
+            </m:r>
+          </m:e>
+          <m:sub>
+            <m:r>
+              <w:rPr>
+                <w:rFonts w:ascii="Cambria Math" w:hAnsi="Cambria Math"/>
+                <w:lang w:bidi="ar"/>
+              </w:rPr>
+              <m:t>v</m:t>
+            </m:r>
+          </m:sub>
+        </m:sSub>
+        <m:r>
+          <w:rPr>
+            <w:rFonts w:ascii="Cambria Math" w:hAnsi="Cambria Math" w:cs="Cambria Math"/>
+            <w:lang w:bidi="ar"/>
+          </w:rPr>
+          <m:t>∈</m:t>
+        </m:r>
+        <m:r>
+          <w:rPr>
+            <w:rFonts w:ascii="Cambria Math" w:hAnsi="Cambria Math"/>
+            <w:lang w:bidi="ar"/>
+          </w:rPr>
+          <m:t xml:space="preserve"> </m:t>
+        </m:r>
+        <m:sSup>
+          <m:sSupPr>
+            <m:ctrlPr>
+              <w:rPr>
+                <w:rFonts w:ascii="Cambria Math" w:hAnsi="Cambria Math"/>
+                <w:i/>
+                <w:lang w:bidi="ar"/>
+              </w:rPr>
+            </m:ctrlPr>
+          </m:sSupPr>
+          <m:e>
+            <m:r>
+              <m:rPr>
+                <m:scr m:val="double-struck"/>
+              </m:rPr>
+              <w:rPr>
+                <w:rFonts w:ascii="Cambria Math" w:hAnsi="Cambria Math"/>
+                <w:lang w:bidi="ar"/>
+              </w:rPr>
+              <m:t>R</m:t>
+            </m:r>
+          </m:e>
+          <m:sup>
+            <m:r>
+              <w:rPr>
+                <w:rFonts w:ascii="Cambria Math" w:hAnsi="Cambria Math"/>
+                <w:lang w:bidi="ar"/>
+              </w:rPr>
+              <m:t>3</m:t>
+            </m:r>
+          </m:sup>
+        </m:sSup>
+      </m:oMath>
+      <w:r>
+        <w:rPr>
+          <w:lang w:bidi="ar"/>
+        </w:rPr>
+        <w:t xml:space="preserve"> is the vector part of quaternion </w:t>
+      </w:r>
+      <m:oMath>
+        <m:r>
+          <w:rPr>
+            <w:rFonts w:ascii="Cambria Math" w:hAnsi="Cambria Math"/>
+            <w:lang w:bidi="ar"/>
+          </w:rPr>
+          <m:t>q</m:t>
+        </m:r>
+      </m:oMath>
+      <w:r>
+        <w:rPr>
+          <w:rFonts w:hAnsi="Cambria Math"/>
+          <w:lang w:bidi="ar"/>
+        </w:rPr>
+        <w:t xml:space="preserve">. </w:t>
+      </w:r>
+      <w:r>
+        <w:rPr>
+          <w:lang w:bidi="ar"/>
+        </w:rPr>
+        <w:t xml:space="preserve">Finally, the PD type torque feedback law </w:t>
+      </w:r>
+    </w:p>
+    <w:p>
+      <w:pPr>
+        <w:rPr>
+          <w:lang w:bidi="ar"/>
+        </w:rPr>
+      </w:pPr>
+      <m:oMathPara>
+        <m:oMath>
+          <m:r>
+            <w:rPr>
+              <w:rFonts w:ascii="Cambria Math" w:hAnsi="Cambria Math"/>
+              <w:lang w:bidi="ar"/>
+            </w:rPr>
+            <m:t>τ=-</m:t>
+          </m:r>
+          <m:sSub>
+            <m:sSubPr>
+              <m:ctrlPr>
+                <w:rPr>
+                  <w:rFonts w:ascii="Cambria Math" w:hAnsi="Cambria Math"/>
+                  <w:i/>
+                  <w:lang w:bidi="ar"/>
+                </w:rPr>
+              </m:ctrlPr>
+            </m:sSubPr>
+            <m:e>
+              <m:r>
+                <w:rPr>
+                  <w:rFonts w:ascii="Cambria Math" w:hAnsi="Cambria Math"/>
+                  <w:lang w:bidi="ar"/>
+                </w:rPr>
+                <m:t>K</m:t>
+              </m:r>
+            </m:e>
+            <m:sub>
+              <m:r>
+                <w:rPr>
+                  <w:rFonts w:ascii="Cambria Math" w:hAnsi="Cambria Math"/>
+                  <w:lang w:bidi="ar"/>
+                </w:rPr>
+                <m:t>R</m:t>
+              </m:r>
+            </m:sub>
+          </m:sSub>
+          <m:sSub>
+            <m:sSubPr>
+              <m:ctrlPr>
+                <w:rPr>
+                  <w:rFonts w:ascii="Cambria Math" w:hAnsi="Cambria Math"/>
+                  <w:i/>
+                  <w:lang w:bidi="ar"/>
+                </w:rPr>
+              </m:ctrlPr>
+            </m:sSubPr>
+            <m:e>
+              <m:r>
+                <w:rPr>
+                  <w:rFonts w:ascii="Cambria Math" w:hAnsi="Cambria Math"/>
+                  <w:lang w:bidi="ar"/>
+                </w:rPr>
+                <m:t>e</m:t>
+              </m:r>
+            </m:e>
+            <m:sub>
+              <m:r>
+                <w:rPr>
+                  <w:rFonts w:ascii="Cambria Math" w:hAnsi="Cambria Math"/>
+                  <w:lang w:bidi="ar"/>
+                </w:rPr>
+                <m:t>R</m:t>
+              </m:r>
+            </m:sub>
+          </m:sSub>
+          <m:r>
+            <w:rPr>
+              <w:rFonts w:ascii="Cambria Math" w:hAnsi="Cambria Math"/>
+              <w:lang w:bidi="ar"/>
+            </w:rPr>
+            <m:t>-</m:t>
+          </m:r>
+          <m:sSub>
+            <m:sSubPr>
+              <m:ctrlPr>
+                <w:rPr>
+                  <w:rFonts w:ascii="Cambria Math" w:hAnsi="Cambria Math"/>
+                  <w:i/>
+                  <w:lang w:bidi="ar"/>
+                </w:rPr>
+              </m:ctrlPr>
+            </m:sSubPr>
+            <m:e>
+              <m:r>
+                <w:rPr>
+                  <w:rFonts w:ascii="Cambria Math" w:hAnsi="Cambria Math"/>
+                  <w:lang w:bidi="ar"/>
+                </w:rPr>
+                <m:t>K</m:t>
+              </m:r>
+            </m:e>
+            <m:sub>
+              <m:r>
+                <w:rPr>
+                  <w:rFonts w:ascii="Cambria Math" w:hAnsi="Cambria Math"/>
+                  <w:lang w:bidi="ar"/>
+                </w:rPr>
+                <m:t>w</m:t>
+              </m:r>
+            </m:sub>
+          </m:sSub>
+          <m:sSub>
+            <m:sSubPr>
+              <m:ctrlPr>
+                <w:rPr>
+                  <w:rFonts w:ascii="Cambria Math" w:hAnsi="Cambria Math"/>
+                  <w:i/>
+                  <w:lang w:bidi="ar"/>
+                </w:rPr>
+              </m:ctrlPr>
+            </m:sSubPr>
+            <m:e>
+              <m:r>
+                <w:rPr>
+                  <w:rFonts w:ascii="Cambria Math" w:hAnsi="Cambria Math"/>
+                  <w:lang w:bidi="ar"/>
+                </w:rPr>
+                <m:t>e</m:t>
+              </m:r>
+            </m:e>
+            <m:sub>
+              <m:r>
+                <w:rPr>
+                  <w:rFonts w:ascii="Cambria Math" w:hAnsi="Cambria Math"/>
+                  <w:lang w:bidi="ar"/>
+                </w:rPr>
+                <m:t>w</m:t>
+              </m:r>
+            </m:sub>
+          </m:sSub>
+        </m:oMath>
+      </m:oMathPara>
+    </w:p>
+    <w:p>
+      <w:pPr>
+        <w:rPr>
+          <w:lang w:bidi="ar"/>
+        </w:rPr>
+      </w:pPr>
+      <w:r>
+        <w:rPr>
+          <w:lang w:bidi="ar"/>
+        </w:rPr>
+        <w:t>is implemented.</w:t>
+      </w:r>
+    </w:p>
+    <w:p>
+      <w:pPr>
+        <w:rPr>
+          <w:rFonts w:eastAsia="SimSun"/>
+        </w:rPr>
+      </w:pPr>
+      <w:r>
+        <w:rPr>
+          <w:rFonts w:eastAsia="SimSun"/>
+        </w:rPr>
+        <w:t>This PD controller is simulated in MuJoCo with a control frequency of 500 Hz. The burn time of each thruster is accumulated as</w:t>
+      </w:r>
+    </w:p>
+    <w:p>
+      <w:pPr>
+        <w:rPr>
+          <w:rFonts w:asciiTheme="minorHAnsi" w:hAnsi="Cambria Math"/>
+          <w:lang w:bidi="ar"/>
+        </w:rPr>
+      </w:pPr>
+      <m:oMathPara>
+        <m:oMath>
+          <m:r>
+            <w:rPr>
+              <w:rFonts w:ascii="Cambria Math" w:hAnsi="Cambria Math"/>
+              <w:lang w:bidi="ar"/>
+            </w:rPr>
+            <m:t>T=N</m:t>
+          </m:r>
+          <m:r>
+            <w:rPr>
+              <w:rFonts w:ascii="Cambria Math" w:hAnsi="Cambria Math" w:cs="Cambria Math"/>
+              <w:lang w:bidi="ar"/>
+            </w:rPr>
+            <m:t>∆</m:t>
+          </m:r>
+          <m:r>
+            <w:rPr>
+              <w:rFonts w:ascii="Cambria Math" w:hAnsi="Cambria Math"/>
+              <w:lang w:bidi="ar"/>
+            </w:rPr>
+            <m:t>t</m:t>
+          </m:r>
+        </m:oMath>
+      </m:oMathPara>
+    </w:p>
+    <w:p>
+      <w:pPr>
+        <w:rPr>
+          <w:rFonts w:eastAsia="SimSun"/>
+        </w:rPr>
+      </w:pPr>
+      <w:r>
+        <w:rPr>
+          <w:rFonts w:eastAsia="SimSun"/>
+        </w:rPr>
+        <w:t xml:space="preserve">where N is the number of simulation steps (frames) during which the thruster is active, and </w:t>
+      </w:r>
+      <m:oMath>
+        <m:r>
+          <w:rPr>
+            <w:rFonts w:ascii="Cambria Math" w:hAnsi="Cambria Math" w:cs="Cambria Math"/>
+            <w:lang w:bidi="ar"/>
+          </w:rPr>
+          <m:t>∆</m:t>
+        </m:r>
+        <m:r>
+          <w:rPr>
+            <w:rFonts w:ascii="Cambria Math" w:hAnsi="Cambria Math"/>
+            <w:lang w:bidi="ar"/>
+          </w:rPr>
+          <m:t>t</m:t>
+        </m:r>
+      </m:oMath>
+      <w:r>
+        <w:rPr>
+          <w:rFonts w:hAnsi="Cambria Math"/>
+          <w:lang w:bidi="ar"/>
+        </w:rPr>
+        <w:t xml:space="preserve"> </w:t>
+      </w:r>
+      <w:r>
+        <w:rPr>
+          <w:rFonts w:eastAsia="SimSun"/>
+        </w:rPr>
+        <w:t>is the time step of each frame, for the purpose of overall fuel consumption evaluation.</w:t>
+      </w:r>
+    </w:p>
+    <w:p>
+      <w:pPr>
+        <w:pStyle w:val="Heading3"/>
+      </w:pPr>
+      <w:r>
+        <w:t>Fuel Consumption With PID</w:t>
+      </w:r>
+    </w:p>
+    <w:p>
+      <w:pPr>
+        <w:pStyle w:val="Heading2"/>
+      </w:pPr>
+      <w:r>
+        <w:t>Hardware</w:t>
+      </w:r>
+    </w:p>
+    <w:p/>
+    <w:p>
+      <w:pPr>
+        <w:pStyle w:val="Heading2"/>
+      </w:pPr>
+      <w:r>
         <w:t>Anomaly Detection</w:t>
       </w:r>
     </w:p>
-    <w:p>
-      <w:r>
-        <w:rPr>
-          <w:highlight w:val="yellow"/>
-        </w:rPr>
-        <w:t>Gourav</w:t>
-      </w:r>
-    </w:p>
+    <w:p/>
     <w:p>
       <w:pPr>
         <w:pStyle w:val="Heading1"/>
       </w:pPr>
-      <w:bookmarkStart w:id="6" w:name="_Ref213919560"/>
-      <w:r>
-        <w:t>Technical Contributions</w:t>
-      </w:r>
-      <w:bookmarkEnd w:id="6"/>
+      <w:bookmarkStart w:id="9" w:name="_Ref213920135"/>
+      <w:r>
+        <w:t>Areas to Improve</w:t>
+      </w:r>
+    </w:p>
+    <w:p>
+      <w:pPr>
+        <w:pStyle w:val="Heading1"/>
+      </w:pPr>
+      <w:r>
+        <w:t>Conclusion</w:t>
+      </w:r>
+      <w:bookmarkEnd w:id="9"/>
+    </w:p>
+    <w:p>
+      <w:pPr>
+        <w:pStyle w:val="Heading1"/>
+      </w:pPr>
+      <w:bookmarkStart w:id="10" w:name="_Ref213920167"/>
+      <w:r>
+        <w:t>Appendix</w:t>
+      </w:r>
+      <w:bookmarkEnd w:id="10"/>
     </w:p>
     <w:p>
       <w:pPr>
         <w:pStyle w:val="Heading2"/>
       </w:pPr>
-      <w:r>
-        <w:t>Path Planning Algorithm</w:t>
-      </w:r>
-    </w:p>
-    <w:p>
-      <w:pPr>
-        <w:pStyle w:val="Heading3"/>
-      </w:pPr>
-      <w:r>
-        <w:t>Description</w:t>
-      </w:r>
-    </w:p>
-    <w:p/>
-    <w:p>
-      <w:pPr>
-        <w:pStyle w:val="Heading3"/>
-      </w:pPr>
-      <w:r>
-        <w:t>Coverage</w:t>
-      </w:r>
-    </w:p>
-    <w:p/>
-    <w:p>
-      <w:pPr>
-        <w:pStyle w:val="Heading2"/>
-      </w:pPr>
-      <w:r>
-        <w:t>Spacecraft Control</w:t>
-      </w:r>
-    </w:p>
-    <w:p>
-      <w:pPr>
-        <w:pStyle w:val="Heading3"/>
-      </w:pPr>
-      <w:r>
-        <w:t>Description</w:t>
-      </w:r>
-    </w:p>
-    <w:p/>
-    <w:p>
-      <w:pPr>
-        <w:pStyle w:val="Heading3"/>
-      </w:pPr>
-      <w:r>
-        <w:t>Fuel Consumption</w:t>
-      </w:r>
-    </w:p>
-    <w:p>
-      <w:pPr>
-        <w:pStyle w:val="Heading2"/>
-      </w:pPr>
-      <w:r>
-        <w:t>Hardware</w:t>
-      </w:r>
-    </w:p>
-    <w:p/>
-    <w:p>
-      <w:pPr>
-        <w:pStyle w:val="Heading2"/>
-      </w:pPr>
-      <w:r>
-        <w:t>Anomaly Detection</w:t>
-      </w:r>
-    </w:p>
-    <w:p/>
-    <w:p>
-      <w:pPr>
-        <w:pStyle w:val="Heading1"/>
-      </w:pPr>
-      <w:bookmarkStart w:id="7" w:name="_Ref213920135"/>
-      <w:r>
-        <w:t>Conclusion</w:t>
-      </w:r>
-      <w:bookmarkEnd w:id="7"/>
-    </w:p>
-    <w:p>
-      <w:pPr>
-        <w:pStyle w:val="Heading1"/>
-      </w:pPr>
-      <w:bookmarkStart w:id="8" w:name="_Ref213920167"/>
-      <w:r>
-        <w:t>Appendix</w:t>
-      </w:r>
-      <w:bookmarkEnd w:id="8"/>
-    </w:p>
-    <w:p>
-      <w:pPr>
-        <w:pStyle w:val="Heading2"/>
-      </w:pPr>
-      <w:bookmarkStart w:id="9" w:name="_Ref213919185"/>
+      <w:bookmarkStart w:id="11" w:name="_Ref213919185"/>
       <w:r>
         <w:t>Cost &amp; Revenue Analysis</w:t>
       </w:r>
-      <w:bookmarkEnd w:id="9"/>
+      <w:bookmarkEnd w:id="11"/>
     </w:p>
     <w:sectPr>
       <w:pgSz w:w="11906" w:h="16838"/>
@@ -1969,9 +4302,9 @@
 <file path=word/numbering.xml><?xml version="1.0" encoding="utf-8"?>
 <w:numbering xmlns:wpc="http://schemas.microsoft.com/office/word/2010/wordprocessingCanvas" xmlns:cx="http://schemas.microsoft.com/office/drawing/2014/chartex" xmlns:cx1="http://schemas.microsoft.com/office/drawing/2015/9/8/chartex" xmlns:cx2="http://schemas.microsoft.com/office/drawing/2015/10/21/chartex" xmlns:cx3="http://schemas.microsoft.com/office/drawing/2016/5/9/chartex" xmlns:cx4="http://schemas.microsoft.com/office/drawing/2016/5/10/chartex" xmlns:cx5="http://schemas.microsoft.com/office/drawing/2016/5/11/chartex" xmlns:cx6="http://schemas.microsoft.com/office/drawing/2016/5/12/chartex" xmlns:cx7="http://schemas.microsoft.com/office/drawing/2016/5/13/chartex" xmlns:cx8="http://schemas.microsoft.com/office/drawing/2016/5/14/chartex" xmlns:mc="http://schemas.openxmlformats.org/markup-compatibility/2006" xmlns:aink="http://schemas.microsoft.com/office/drawing/2016/ink" xmlns:am3d="http://schemas.microsoft.com/office/drawing/2017/model3d" xmlns:o="urn:schemas-microsoft-com:office:office" xmlns:oel="http://schemas.microsoft.com/office/2019/extlst" xmlns:r="http://schemas.openxmlformats.org/officeDocument/2006/relationships" xmlns:m="http://schemas.openxmlformats.org/officeDocument/2006/math" xmlns:v="urn:schemas-microsoft-com:vml" xmlns:wp14="http://schemas.microsoft.com/office/word/2010/wordprocessingDrawing" xmlns:wp="http://schemas.openxmlformats.org/drawingml/2006/wordprocessingDrawing" xmlns:w10="urn:schemas-microsoft-com:office:word" xmlns:w="http://schemas.openxmlformats.org/wordprocessingml/2006/main" xmlns:w14="http://schemas.microsoft.com/office/word/2010/wordml" xmlns:w15="http://schemas.microsoft.com/office/word/2012/wordml" xmlns:w16cex="http://schemas.microsoft.com/office/word/2018/wordml/cex" xmlns:w16cid="http://schemas.microsoft.com/office/word/2016/wordml/cid" xmlns:w16="http://schemas.microsoft.com/office/word/2018/wordml" xmlns:w16du="http://schemas.microsoft.com/office/word/2023/wordml/word16du" xmlns:w16sdtdh="http://schemas.microsoft.com/office/word/2020/wordml/sdtdatahash" xmlns:w16sdtfl="http://schemas.microsoft.com/office/word/2024/wordml/sdtformatlock" xmlns:w16se="http://schemas.microsoft.com/office/word/2015/wordml/symex" xmlns:wpg="http://schemas.microsoft.com/office/word/2010/wordprocessingGroup" xmlns:wpi="http://schemas.microsoft.com/office/word/2010/wordprocessingInk" xmlns:wne="http://schemas.microsoft.com/office/word/2006/wordml" xmlns:wps="http://schemas.microsoft.com/office/word/2010/wordprocessingShape" mc:Ignorable="w14 w15 w16se w16cid w16 w16cex w16sdtdh w16sdtfl w16du wp14">
   <w:abstractNum w:abstractNumId="0" w15:restartNumberingAfterBreak="0">
-    <w:nsid w:val="450B6C6A"/>
+    <w:nsid w:val="2AD8601C"/>
     <w:multiLevelType w:val="hybridMultilevel"/>
-    <w:tmpl w:val="90BA9558"/>
+    <w:tmpl w:val="EB3E5CDE"/>
     <w:lvl w:ilvl="0" w:tplc="0409000F">
       <w:start w:val="1"/>
       <w:numFmt w:val="decimal"/>
@@ -2058,6 +4391,95 @@
     </w:lvl>
   </w:abstractNum>
   <w:abstractNum w:abstractNumId="1" w15:restartNumberingAfterBreak="0">
+    <w:nsid w:val="450B6C6A"/>
+    <w:multiLevelType w:val="hybridMultilevel"/>
+    <w:tmpl w:val="90BA9558"/>
+    <w:lvl w:ilvl="0" w:tplc="0409000F">
+      <w:start w:val="1"/>
+      <w:numFmt w:val="decimal"/>
+      <w:lvlText w:val="%1."/>
+      <w:lvlJc w:val="left"/>
+      <w:pPr>
+        <w:ind w:left="720" w:hanging="360"/>
+      </w:pPr>
+      <w:rPr>
+        <w:rFonts w:hint="default"/>
+      </w:rPr>
+    </w:lvl>
+    <w:lvl w:ilvl="1" w:tplc="04090019" w:tentative="1">
+      <w:start w:val="1"/>
+      <w:numFmt w:val="lowerLetter"/>
+      <w:lvlText w:val="%2."/>
+      <w:lvlJc w:val="left"/>
+      <w:pPr>
+        <w:ind w:left="1440" w:hanging="360"/>
+      </w:pPr>
+    </w:lvl>
+    <w:lvl w:ilvl="2" w:tplc="0409001B" w:tentative="1">
+      <w:start w:val="1"/>
+      <w:numFmt w:val="lowerRoman"/>
+      <w:lvlText w:val="%3."/>
+      <w:lvlJc w:val="right"/>
+      <w:pPr>
+        <w:ind w:left="2160" w:hanging="180"/>
+      </w:pPr>
+    </w:lvl>
+    <w:lvl w:ilvl="3" w:tplc="0409000F" w:tentative="1">
+      <w:start w:val="1"/>
+      <w:numFmt w:val="decimal"/>
+      <w:lvlText w:val="%4."/>
+      <w:lvlJc w:val="left"/>
+      <w:pPr>
+        <w:ind w:left="2880" w:hanging="360"/>
+      </w:pPr>
+    </w:lvl>
+    <w:lvl w:ilvl="4" w:tplc="04090019" w:tentative="1">
+      <w:start w:val="1"/>
+      <w:numFmt w:val="lowerLetter"/>
+      <w:lvlText w:val="%5."/>
+      <w:lvlJc w:val="left"/>
+      <w:pPr>
+        <w:ind w:left="3600" w:hanging="360"/>
+      </w:pPr>
+    </w:lvl>
+    <w:lvl w:ilvl="5" w:tplc="0409001B" w:tentative="1">
+      <w:start w:val="1"/>
+      <w:numFmt w:val="lowerRoman"/>
+      <w:lvlText w:val="%6."/>
+      <w:lvlJc w:val="right"/>
+      <w:pPr>
+        <w:ind w:left="4320" w:hanging="180"/>
+      </w:pPr>
+    </w:lvl>
+    <w:lvl w:ilvl="6" w:tplc="0409000F" w:tentative="1">
+      <w:start w:val="1"/>
+      <w:numFmt w:val="decimal"/>
+      <w:lvlText w:val="%7."/>
+      <w:lvlJc w:val="left"/>
+      <w:pPr>
+        <w:ind w:left="5040" w:hanging="360"/>
+      </w:pPr>
+    </w:lvl>
+    <w:lvl w:ilvl="7" w:tplc="04090019" w:tentative="1">
+      <w:start w:val="1"/>
+      <w:numFmt w:val="lowerLetter"/>
+      <w:lvlText w:val="%8."/>
+      <w:lvlJc w:val="left"/>
+      <w:pPr>
+        <w:ind w:left="5760" w:hanging="360"/>
+      </w:pPr>
+    </w:lvl>
+    <w:lvl w:ilvl="8" w:tplc="0409001B" w:tentative="1">
+      <w:start w:val="1"/>
+      <w:numFmt w:val="lowerRoman"/>
+      <w:lvlText w:val="%9."/>
+      <w:lvlJc w:val="right"/>
+      <w:pPr>
+        <w:ind w:left="6480" w:hanging="180"/>
+      </w:pPr>
+    </w:lvl>
+  </w:abstractNum>
+  <w:abstractNum w:abstractNumId="2" w15:restartNumberingAfterBreak="0">
     <w:nsid w:val="45F641E6"/>
     <w:multiLevelType w:val="hybridMultilevel"/>
     <w:tmpl w:val="CD9669EC"/>
@@ -2170,7 +4592,7 @@
       </w:rPr>
     </w:lvl>
   </w:abstractNum>
-  <w:abstractNum w:abstractNumId="2" w15:restartNumberingAfterBreak="0">
+  <w:abstractNum w:abstractNumId="3" w15:restartNumberingAfterBreak="0">
     <w:nsid w:val="56A52E58"/>
     <w:multiLevelType w:val="multilevel"/>
     <w:tmpl w:val="C732612A"/>
@@ -2291,7 +4713,21 @@
       </w:rPr>
     </w:lvl>
   </w:abstractNum>
-  <w:abstractNum w:abstractNumId="3" w15:restartNumberingAfterBreak="0">
+  <w:abstractNum w:abstractNumId="4" w15:restartNumberingAfterBreak="0">
+    <w:nsid w:val="571EC5EC"/>
+    <w:multiLevelType w:val="singleLevel"/>
+    <w:tmpl w:val="571EC5EC"/>
+    <w:lvl w:ilvl="0">
+      <w:start w:val="1"/>
+      <w:numFmt w:val="decimal"/>
+      <w:lvlText w:val="%1."/>
+      <w:lvlJc w:val="left"/>
+      <w:pPr>
+        <w:ind w:left="425" w:hanging="425"/>
+      </w:pPr>
+    </w:lvl>
+  </w:abstractNum>
+  <w:abstractNum w:abstractNumId="5" w15:restartNumberingAfterBreak="0">
     <w:nsid w:val="5C0C0C4E"/>
     <w:multiLevelType w:val="hybridMultilevel"/>
     <w:tmpl w:val="847CE944"/>
@@ -2380,7 +4816,96 @@
       </w:pPr>
     </w:lvl>
   </w:abstractNum>
-  <w:abstractNum w:abstractNumId="4" w15:restartNumberingAfterBreak="0">
+  <w:abstractNum w:abstractNumId="6" w15:restartNumberingAfterBreak="0">
+    <w:nsid w:val="6E6B53C5"/>
+    <w:multiLevelType w:val="hybridMultilevel"/>
+    <w:tmpl w:val="0B507EDE"/>
+    <w:lvl w:ilvl="0" w:tplc="0409000F">
+      <w:start w:val="1"/>
+      <w:numFmt w:val="decimal"/>
+      <w:lvlText w:val="%1."/>
+      <w:lvlJc w:val="left"/>
+      <w:pPr>
+        <w:ind w:left="720" w:hanging="360"/>
+      </w:pPr>
+      <w:rPr>
+        <w:rFonts w:hint="default"/>
+      </w:rPr>
+    </w:lvl>
+    <w:lvl w:ilvl="1" w:tplc="04090019" w:tentative="1">
+      <w:start w:val="1"/>
+      <w:numFmt w:val="lowerLetter"/>
+      <w:lvlText w:val="%2."/>
+      <w:lvlJc w:val="left"/>
+      <w:pPr>
+        <w:ind w:left="1440" w:hanging="360"/>
+      </w:pPr>
+    </w:lvl>
+    <w:lvl w:ilvl="2" w:tplc="0409001B" w:tentative="1">
+      <w:start w:val="1"/>
+      <w:numFmt w:val="lowerRoman"/>
+      <w:lvlText w:val="%3."/>
+      <w:lvlJc w:val="right"/>
+      <w:pPr>
+        <w:ind w:left="2160" w:hanging="180"/>
+      </w:pPr>
+    </w:lvl>
+    <w:lvl w:ilvl="3" w:tplc="0409000F" w:tentative="1">
+      <w:start w:val="1"/>
+      <w:numFmt w:val="decimal"/>
+      <w:lvlText w:val="%4."/>
+      <w:lvlJc w:val="left"/>
+      <w:pPr>
+        <w:ind w:left="2880" w:hanging="360"/>
+      </w:pPr>
+    </w:lvl>
+    <w:lvl w:ilvl="4" w:tplc="04090019" w:tentative="1">
+      <w:start w:val="1"/>
+      <w:numFmt w:val="lowerLetter"/>
+      <w:lvlText w:val="%5."/>
+      <w:lvlJc w:val="left"/>
+      <w:pPr>
+        <w:ind w:left="3600" w:hanging="360"/>
+      </w:pPr>
+    </w:lvl>
+    <w:lvl w:ilvl="5" w:tplc="0409001B" w:tentative="1">
+      <w:start w:val="1"/>
+      <w:numFmt w:val="lowerRoman"/>
+      <w:lvlText w:val="%6."/>
+      <w:lvlJc w:val="right"/>
+      <w:pPr>
+        <w:ind w:left="4320" w:hanging="180"/>
+      </w:pPr>
+    </w:lvl>
+    <w:lvl w:ilvl="6" w:tplc="0409000F" w:tentative="1">
+      <w:start w:val="1"/>
+      <w:numFmt w:val="decimal"/>
+      <w:lvlText w:val="%7."/>
+      <w:lvlJc w:val="left"/>
+      <w:pPr>
+        <w:ind w:left="5040" w:hanging="360"/>
+      </w:pPr>
+    </w:lvl>
+    <w:lvl w:ilvl="7" w:tplc="04090019" w:tentative="1">
+      <w:start w:val="1"/>
+      <w:numFmt w:val="lowerLetter"/>
+      <w:lvlText w:val="%8."/>
+      <w:lvlJc w:val="left"/>
+      <w:pPr>
+        <w:ind w:left="5760" w:hanging="360"/>
+      </w:pPr>
+    </w:lvl>
+    <w:lvl w:ilvl="8" w:tplc="0409001B" w:tentative="1">
+      <w:start w:val="1"/>
+      <w:numFmt w:val="lowerRoman"/>
+      <w:lvlText w:val="%9."/>
+      <w:lvlJc w:val="right"/>
+      <w:pPr>
+        <w:ind w:left="6480" w:hanging="180"/>
+      </w:pPr>
+    </w:lvl>
+  </w:abstractNum>
+  <w:abstractNum w:abstractNumId="7" w15:restartNumberingAfterBreak="0">
     <w:nsid w:val="7BE434FE"/>
     <w:multiLevelType w:val="hybridMultilevel"/>
     <w:tmpl w:val="52FE574C"/>
@@ -2494,19 +5019,31 @@
     </w:lvl>
   </w:abstractNum>
   <w:num w:numId="1" w16cid:durableId="1496192099">
+    <w:abstractNumId w:val="3"/>
+  </w:num>
+  <w:num w:numId="2" w16cid:durableId="1696075855">
+    <w:abstractNumId w:val="1"/>
+  </w:num>
+  <w:num w:numId="3" w16cid:durableId="499079579">
     <w:abstractNumId w:val="2"/>
   </w:num>
-  <w:num w:numId="2" w16cid:durableId="1696075855">
+  <w:num w:numId="4" w16cid:durableId="227107983">
+    <w:abstractNumId w:val="7"/>
+  </w:num>
+  <w:num w:numId="5" w16cid:durableId="1091390083">
+    <w:abstractNumId w:val="5"/>
+  </w:num>
+  <w:num w:numId="6" w16cid:durableId="1271083180">
+    <w:abstractNumId w:val="4"/>
+    <w:lvlOverride w:ilvl="0">
+      <w:startOverride w:val="1"/>
+    </w:lvlOverride>
+  </w:num>
+  <w:num w:numId="7" w16cid:durableId="1059983266">
     <w:abstractNumId w:val="0"/>
   </w:num>
-  <w:num w:numId="3" w16cid:durableId="499079579">
-    <w:abstractNumId w:val="1"/>
-  </w:num>
-  <w:num w:numId="4" w16cid:durableId="227107983">
-    <w:abstractNumId w:val="4"/>
-  </w:num>
-  <w:num w:numId="5" w16cid:durableId="1091390083">
-    <w:abstractNumId w:val="3"/>
+  <w:num w:numId="8" w16cid:durableId="1332296957">
+    <w:abstractNumId w:val="6"/>
   </w:num>
 </w:numbering>
 </file>
@@ -2625,7 +5162,7 @@
     <w:lsdException w:name="E-mail Signature" w:semiHidden="1" w:unhideWhenUsed="1"/>
     <w:lsdException w:name="HTML Top of Form" w:semiHidden="1" w:unhideWhenUsed="1"/>
     <w:lsdException w:name="HTML Bottom of Form" w:semiHidden="1" w:unhideWhenUsed="1"/>
-    <w:lsdException w:name="Normal (Web)" w:semiHidden="1" w:unhideWhenUsed="1"/>
+    <w:lsdException w:name="Normal (Web)" w:semiHidden="1" w:uiPriority="0" w:unhideWhenUsed="1"/>
     <w:lsdException w:name="HTML Acronym" w:semiHidden="1" w:unhideWhenUsed="1"/>
     <w:lsdException w:name="HTML Address" w:semiHidden="1" w:unhideWhenUsed="1"/>
     <w:lsdException w:name="HTML Cite" w:semiHidden="1" w:unhideWhenUsed="1"/>
@@ -3127,7 +5664,6 @@
   <w:style w:type="character" w:default="1" w:styleId="DefaultParagraphFont">
     <w:name w:val="Default Paragraph Font"/>
     <w:uiPriority w:val="1"/>
-    <w:semiHidden/>
     <w:unhideWhenUsed/>
   </w:style>
   <w:style w:type="table" w:default="1" w:styleId="TableNormal">
@@ -3528,6 +6064,24 @@
       <w:szCs w:val="20"/>
     </w:rPr>
   </w:style>
+  <w:style w:type="paragraph" w:styleId="NormalWeb">
+    <w:name w:val="Normal (Web)"/>
+    <w:basedOn w:val="Normal"/>
+    <w:unhideWhenUsed/>
+    <w:rsid w:val="00C0697A"/>
+    <w:pPr>
+      <w:widowControl w:val="0"/>
+      <w:spacing w:before="100" w:beforeAutospacing="1" w:after="100" w:afterAutospacing="1" w:line="240" w:lineRule="auto"/>
+      <w:jc w:val="left"/>
+    </w:pPr>
+    <w:rPr>
+      <w:rFonts w:asciiTheme="minorHAnsi" w:hAnsiTheme="minorHAnsi"/>
+      <w:kern w:val="0"/>
+      <w:sz w:val="24"/>
+      <w:szCs w:val="24"/>
+      <w14:ligatures w14:val="none"/>
+    </w:rPr>
+  </w:style>
 </w:styles>
 </file>
 

</xml_diff>